<commit_message>
remove chapter about back
</commit_message>
<xml_diff>
--- a/Chudopalov_B_A_RAZRABOTKA_PLATFORMI_UPRAVLENIA_PROGRAMMNIMI_PROEKTAMI.docx
+++ b/Chudopalov_B_A_RAZRABOTKA_PLATFORMI_UPRAVLENIA_PROGRAMMNIMI_PROEKTAMI.docx
@@ -407,16 +407,16 @@
                 <w:szCs w:val="28"/>
               </w:rPr>
             </w:pPr>
-            <w:bookmarkStart w:id="1" w:name="_Toc195522934"/>
-            <w:bookmarkStart w:id="2" w:name="_Toc196051117"/>
-            <w:bookmarkStart w:id="3" w:name="_Toc195140816"/>
-            <w:bookmarkStart w:id="4" w:name="_Toc195139999"/>
-            <w:bookmarkStart w:id="5" w:name="_Toc197412251"/>
-            <w:bookmarkStart w:id="6" w:name="_Toc197217238"/>
+            <w:bookmarkStart w:id="1" w:name="_Toc197410299"/>
+            <w:bookmarkStart w:id="2" w:name="_Toc195522934"/>
+            <w:bookmarkStart w:id="3" w:name="_Toc196051117"/>
+            <w:bookmarkStart w:id="4" w:name="_Toc195140816"/>
+            <w:bookmarkStart w:id="5" w:name="_Toc195139999"/>
+            <w:bookmarkStart w:id="6" w:name="_Toc197412251"/>
             <w:bookmarkStart w:id="7" w:name="_Toc195195707"/>
-            <w:bookmarkStart w:id="8" w:name="_Toc195525835"/>
+            <w:bookmarkStart w:id="8" w:name="_Toc197217238"/>
             <w:bookmarkStart w:id="9" w:name="_Toc195140758"/>
-            <w:bookmarkStart w:id="10" w:name="_Toc197410299"/>
+            <w:bookmarkStart w:id="10" w:name="_Toc195525835"/>
             <w:r>
               <w:rPr>
                 <w:rFonts w:eastAsia="Times New Roman" w:cs="Times New Roman" w:ascii="Times New Roman" w:hAnsi="Times New Roman"/>
@@ -501,16 +501,16 @@
                 <w:szCs w:val="28"/>
               </w:rPr>
             </w:pPr>
-            <w:bookmarkStart w:id="11" w:name="_Toc195140000"/>
-            <w:bookmarkStart w:id="12" w:name="_Toc197412252"/>
-            <w:bookmarkStart w:id="13" w:name="_Toc196051118"/>
-            <w:bookmarkStart w:id="14" w:name="_Toc197410300"/>
-            <w:bookmarkStart w:id="15" w:name="_Toc195525836"/>
-            <w:bookmarkStart w:id="16" w:name="_Toc195140817"/>
-            <w:bookmarkStart w:id="17" w:name="_Toc195195708"/>
-            <w:bookmarkStart w:id="18" w:name="_Toc197217239"/>
-            <w:bookmarkStart w:id="19" w:name="_Toc195522935"/>
-            <w:bookmarkStart w:id="20" w:name="_Toc195140759"/>
+            <w:bookmarkStart w:id="11" w:name="_Toc195195708"/>
+            <w:bookmarkStart w:id="12" w:name="_Toc195140759"/>
+            <w:bookmarkStart w:id="13" w:name="_Toc195522935"/>
+            <w:bookmarkStart w:id="14" w:name="_Toc197217239"/>
+            <w:bookmarkStart w:id="15" w:name="_Toc195140817"/>
+            <w:bookmarkStart w:id="16" w:name="_Toc197410300"/>
+            <w:bookmarkStart w:id="17" w:name="_Toc196051118"/>
+            <w:bookmarkStart w:id="18" w:name="_Toc197412252"/>
+            <w:bookmarkStart w:id="19" w:name="_Toc195140000"/>
+            <w:bookmarkStart w:id="20" w:name="_Toc195525836"/>
             <w:r>
               <w:rPr>
                 <w:rFonts w:eastAsia="Calibri" w:cs="Times New Roman" w:ascii="Times New Roman" w:hAnsi="Times New Roman"/>
@@ -569,16 +569,16 @@
                 <w:szCs w:val="28"/>
               </w:rPr>
             </w:pPr>
-            <w:bookmarkStart w:id="21" w:name="_Toc197410301"/>
-            <w:bookmarkStart w:id="22" w:name="_Toc195140001"/>
-            <w:bookmarkStart w:id="23" w:name="_Toc195525837"/>
-            <w:bookmarkStart w:id="24" w:name="_Toc197217240"/>
-            <w:bookmarkStart w:id="25" w:name="_Toc196051119"/>
+            <w:bookmarkStart w:id="21" w:name="_Toc195525837"/>
+            <w:bookmarkStart w:id="22" w:name="_Toc195140818"/>
+            <w:bookmarkStart w:id="23" w:name="_Toc197412253"/>
+            <w:bookmarkStart w:id="24" w:name="_Toc195140760"/>
+            <w:bookmarkStart w:id="25" w:name="_Toc195195709"/>
             <w:bookmarkStart w:id="26" w:name="_Toc195522936"/>
-            <w:bookmarkStart w:id="27" w:name="_Toc195195709"/>
-            <w:bookmarkStart w:id="28" w:name="_Toc195140760"/>
-            <w:bookmarkStart w:id="29" w:name="_Toc197412253"/>
-            <w:bookmarkStart w:id="30" w:name="_Toc195140818"/>
+            <w:bookmarkStart w:id="27" w:name="_Toc196051119"/>
+            <w:bookmarkStart w:id="28" w:name="_Toc197217240"/>
+            <w:bookmarkStart w:id="29" w:name="_Toc195140001"/>
+            <w:bookmarkStart w:id="30" w:name="_Toc197410301"/>
             <w:r>
               <w:rPr>
                 <w:rFonts w:eastAsia="Times New Roman" w:cs="Times New Roman" w:ascii="Times New Roman" w:hAnsi="Times New Roman"/>
@@ -713,16 +713,16 @@
                 <w:szCs w:val="28"/>
               </w:rPr>
             </w:pPr>
-            <w:bookmarkStart w:id="31" w:name="_Toc197217241"/>
-            <w:bookmarkStart w:id="32" w:name="_Toc195195710"/>
-            <w:bookmarkStart w:id="33" w:name="_Toc197410302"/>
+            <w:bookmarkStart w:id="31" w:name="_Toc197410302"/>
+            <w:bookmarkStart w:id="32" w:name="_Toc197217241"/>
+            <w:bookmarkStart w:id="33" w:name="_Toc195195710"/>
             <w:bookmarkStart w:id="34" w:name="_Toc197412254"/>
             <w:bookmarkStart w:id="35" w:name="_Toc196051120"/>
             <w:bookmarkStart w:id="36" w:name="_Toc195525838"/>
             <w:bookmarkStart w:id="37" w:name="_Toc195522937"/>
-            <w:bookmarkStart w:id="38" w:name="_Toc195140819"/>
-            <w:bookmarkStart w:id="39" w:name="_Toc195140761"/>
-            <w:bookmarkStart w:id="40" w:name="_Toc195140002"/>
+            <w:bookmarkStart w:id="38" w:name="_Toc195140761"/>
+            <w:bookmarkStart w:id="39" w:name="_Toc195140002"/>
+            <w:bookmarkStart w:id="40" w:name="_Toc195140819"/>
             <w:r>
               <w:rPr>
                 <w:rFonts w:eastAsia="Times New Roman" w:cs="Times New Roman" w:ascii="Times New Roman" w:hAnsi="Times New Roman"/>
@@ -807,16 +807,16 @@
                 <w:szCs w:val="28"/>
               </w:rPr>
             </w:pPr>
-            <w:bookmarkStart w:id="41" w:name="_Toc195522938"/>
-            <w:bookmarkStart w:id="42" w:name="_Toc195525839"/>
-            <w:bookmarkStart w:id="43" w:name="_Toc197217242"/>
-            <w:bookmarkStart w:id="44" w:name="_Toc196051121"/>
-            <w:bookmarkStart w:id="45" w:name="_Toc197412255"/>
-            <w:bookmarkStart w:id="46" w:name="_Toc195140003"/>
-            <w:bookmarkStart w:id="47" w:name="_Toc195140820"/>
-            <w:bookmarkStart w:id="48" w:name="_Toc195140762"/>
-            <w:bookmarkStart w:id="49" w:name="_Toc195195711"/>
-            <w:bookmarkStart w:id="50" w:name="_Toc197410303"/>
+            <w:bookmarkStart w:id="41" w:name="_Toc195140003"/>
+            <w:bookmarkStart w:id="42" w:name="_Toc195522938"/>
+            <w:bookmarkStart w:id="43" w:name="_Toc195525839"/>
+            <w:bookmarkStart w:id="44" w:name="_Toc197412255"/>
+            <w:bookmarkStart w:id="45" w:name="_Toc196051121"/>
+            <w:bookmarkStart w:id="46" w:name="_Toc195140762"/>
+            <w:bookmarkStart w:id="47" w:name="_Toc195195711"/>
+            <w:bookmarkStart w:id="48" w:name="_Toc197410303"/>
+            <w:bookmarkStart w:id="49" w:name="_Toc197217242"/>
+            <w:bookmarkStart w:id="50" w:name="_Toc195140820"/>
             <w:r>
               <w:rPr>
                 <w:rFonts w:eastAsia="Calibri" w:cs="Times New Roman" w:ascii="Times New Roman" w:hAnsi="Times New Roman"/>
@@ -875,14 +875,14 @@
                 <w:szCs w:val="28"/>
               </w:rPr>
             </w:pPr>
-            <w:bookmarkStart w:id="51" w:name="_Toc195140821"/>
-            <w:bookmarkStart w:id="52" w:name="_Toc195195712"/>
-            <w:bookmarkStart w:id="53" w:name="_Toc195522939"/>
-            <w:bookmarkStart w:id="54" w:name="_Toc195525840"/>
-            <w:bookmarkStart w:id="55" w:name="_Toc196051122"/>
-            <w:bookmarkStart w:id="56" w:name="_Toc197217243"/>
-            <w:bookmarkStart w:id="57" w:name="_Toc195140004"/>
-            <w:bookmarkStart w:id="58" w:name="_Toc195140763"/>
+            <w:bookmarkStart w:id="51" w:name="_Toc195140763"/>
+            <w:bookmarkStart w:id="52" w:name="_Toc195140821"/>
+            <w:bookmarkStart w:id="53" w:name="_Toc195195712"/>
+            <w:bookmarkStart w:id="54" w:name="_Toc195522939"/>
+            <w:bookmarkStart w:id="55" w:name="_Toc195525840"/>
+            <w:bookmarkStart w:id="56" w:name="_Toc196051122"/>
+            <w:bookmarkStart w:id="57" w:name="_Toc197217243"/>
+            <w:bookmarkStart w:id="58" w:name="_Toc195140004"/>
             <w:bookmarkStart w:id="59" w:name="_Toc197410304"/>
             <w:bookmarkStart w:id="60" w:name="_Toc197412256"/>
             <w:r>
@@ -994,16 +994,7 @@
           <w:sz w:val="28"/>
           <w:szCs w:val="28"/>
         </w:rPr>
-        <w:t>Чудопалов, Б.А. Разработка платформы управления программными проектами</w:t>
-      </w:r>
-      <w:r>
-        <w:rPr>
-          <w:rFonts w:cs="Times New Roman" w:ascii="Liberation Serif" w:hAnsi="Liberation Serif"/>
-          <w:color w:val="FFFFFF"/>
-          <w:sz w:val="28"/>
-          <w:szCs w:val="28"/>
-        </w:rPr>
-        <w:t>: выпускн. квалиф. работа: 09.03.04. – Симферополь: КФУ им. В.И. Вернадского, 2026. – 45 с., 35 ил., 7 ист., 2 табл.</w:t>
+        <w:t>Чудопалов, Б.А. Разработка платформы управления программными проектами: выпускн. квалиф. работа: 09.03.04. – Симферополь: КФУ им. В.И. Вернадского, 2026. – 45 с., 35 ил., 7 ист., 2 табл.</w:t>
       </w:r>
     </w:p>
     <w:p>
@@ -1806,11 +1797,11 @@
       <w:r>
         <w:br w:type="page"/>
       </w:r>
-      <w:bookmarkStart w:id="61" w:name="_Toc197410306"/>
-      <w:bookmarkStart w:id="62" w:name="_Toc197412258"/>
+      <w:bookmarkStart w:id="61" w:name="_Toc102500951"/>
+      <w:bookmarkStart w:id="62" w:name="_Toc195525842"/>
       <w:bookmarkStart w:id="63" w:name="_Toc195522941"/>
-      <w:bookmarkStart w:id="64" w:name="_Toc195525842"/>
-      <w:bookmarkStart w:id="65" w:name="_Toc102500951"/>
+      <w:bookmarkStart w:id="64" w:name="_Toc197412258"/>
+      <w:bookmarkStart w:id="65" w:name="_Toc197410306"/>
       <w:r>
         <w:rPr>
           <w:rFonts w:cs="Times New Roman" w:ascii="Liberation Serif" w:hAnsi="Liberation Serif"/>
@@ -2087,7 +2078,7 @@
       </w:r>
       <w:r>
         <w:rPr>
-          <w:rStyle w:val="user4"/>
+          <w:rStyle w:val="Style19"/>
           <w:rFonts w:eastAsia="" w:ascii="Liberation Serif" w:hAnsi="Liberation Serif" w:eastAsiaTheme="majorEastAsia"/>
           <w:b w:val="false"/>
           <w:bCs w:val="false"/>
@@ -3056,7 +3047,7 @@
           <w:rFonts w:ascii="Liberation Serif" w:hAnsi="Liberation Serif"/>
           <w:b/>
           <w:bCs/>
-          <w:color w:val="FFFFFF"/>
+          <w:color w:themeColor="accent1" w:themeShade="bf" w:val="FFFFFF"/>
         </w:rPr>
       </w:r>
     </w:p>
@@ -3253,14 +3244,6 @@
           <w:szCs w:val="28"/>
         </w:rPr>
         <w:tab/>
-      </w:r>
-      <w:r>
-        <w:rPr>
-          <w:rFonts w:cs="Times New Roman" w:ascii="Liberation Serif" w:hAnsi="Liberation Serif"/>
-          <w:color w:val="FFFFFF"/>
-          <w:sz w:val="28"/>
-          <w:szCs w:val="28"/>
-        </w:rPr>
         <w:t>Jenkins — это одна из старейших и наиболее распространенных систем автоматизации с открытым исходным кодом, написанная на Java. Основное преимущество Jenkins заключается в его расширяемости: функциональность обеспечивается тысячами плагинов, поддерживаемых сообществом[3].</w:t>
       </w:r>
     </w:p>
@@ -3471,7 +3454,7 @@
       <w:r>
         <w:rPr>
           <w:rFonts w:cs="Times New Roman" w:ascii="Liberation Serif" w:hAnsi="Liberation Serif"/>
-          <w:color w:val="FFFFFF"/>
+          <w:color w:themeColor="accent1" w:themeShade="bf" w:val="FFFFFF"/>
           <w:sz w:val="28"/>
           <w:szCs w:val="28"/>
         </w:rPr>
@@ -3810,7 +3793,7 @@
       </w:r>
       <w:r>
         <w:rPr>
-          <w:rStyle w:val="user4"/>
+          <w:rStyle w:val="Style19"/>
           <w:rFonts w:ascii="Liberation Serif" w:hAnsi="Liberation Serif"/>
           <w:color w:val="FFFFFF"/>
           <w:sz w:val="28"/>
@@ -4028,8 +4011,8 @@
           <w:color w:val="FFFFFF"/>
         </w:rPr>
       </w:pPr>
-      <w:bookmarkStart w:id="74" w:name="_Hlk194590313"/>
-      <w:bookmarkStart w:id="75" w:name="_Hlk194590271"/>
+      <w:bookmarkStart w:id="74" w:name="_Hlk194590271"/>
+      <w:bookmarkStart w:id="75" w:name="_Hlk194590313"/>
       <w:bookmarkEnd w:id="74"/>
       <w:bookmarkEnd w:id="75"/>
       <w:r>
@@ -4060,8 +4043,8 @@
       <w:tblGrid>
         <w:gridCol w:w="2840"/>
         <w:gridCol w:w="1128"/>
-        <w:gridCol w:w="1922"/>
-        <w:gridCol w:w="1594"/>
+        <w:gridCol w:w="1921"/>
+        <w:gridCol w:w="1595"/>
         <w:gridCol w:w="1871"/>
       </w:tblGrid>
       <w:tr>
@@ -4082,7 +4065,7 @@
           </w:tcPr>
           <w:p>
             <w:pPr>
-              <w:pStyle w:val="Style21"/>
+              <w:pStyle w:val="user6"/>
               <w:spacing w:before="0" w:after="160"/>
               <w:jc w:val="center"/>
               <w:rPr>
@@ -4134,7 +4117,7 @@
           </w:tcPr>
           <w:p>
             <w:pPr>
-              <w:pStyle w:val="Style21"/>
+              <w:pStyle w:val="user6"/>
               <w:spacing w:before="0" w:after="160"/>
               <w:jc w:val="center"/>
               <w:rPr>
@@ -4155,7 +4138,7 @@
         </w:tc>
         <w:tc>
           <w:tcPr>
-            <w:tcW w:w="1922" w:type="dxa"/>
+            <w:tcW w:w="1921" w:type="dxa"/>
             <w:tcBorders>
               <w:top w:val="single" w:sz="4" w:space="0" w:color="000000"/>
               <w:left w:val="single" w:sz="4" w:space="0" w:color="000000"/>
@@ -4167,7 +4150,7 @@
           </w:tcPr>
           <w:p>
             <w:pPr>
-              <w:pStyle w:val="Style21"/>
+              <w:pStyle w:val="user6"/>
               <w:spacing w:before="0" w:after="160"/>
               <w:jc w:val="center"/>
               <w:rPr>
@@ -4188,7 +4171,7 @@
         </w:tc>
         <w:tc>
           <w:tcPr>
-            <w:tcW w:w="1594" w:type="dxa"/>
+            <w:tcW w:w="1595" w:type="dxa"/>
             <w:tcBorders>
               <w:top w:val="single" w:sz="4" w:space="0" w:color="000000"/>
               <w:left w:val="single" w:sz="4" w:space="0" w:color="000000"/>
@@ -4200,7 +4183,7 @@
           </w:tcPr>
           <w:p>
             <w:pPr>
-              <w:pStyle w:val="Style21"/>
+              <w:pStyle w:val="user6"/>
               <w:spacing w:before="0" w:after="160"/>
               <w:jc w:val="center"/>
               <w:rPr>
@@ -4233,7 +4216,7 @@
           </w:tcPr>
           <w:p>
             <w:pPr>
-              <w:pStyle w:val="Style21"/>
+              <w:pStyle w:val="user6"/>
               <w:spacing w:before="0" w:after="160"/>
               <w:jc w:val="center"/>
               <w:rPr>
@@ -4270,7 +4253,7 @@
           </w:tcPr>
           <w:p>
             <w:pPr>
-              <w:pStyle w:val="Style21"/>
+              <w:pStyle w:val="user6"/>
               <w:spacing w:before="0" w:after="160"/>
               <w:jc w:val="both"/>
               <w:rPr>
@@ -4302,7 +4285,7 @@
           </w:tcPr>
           <w:p>
             <w:pPr>
-              <w:pStyle w:val="Style21"/>
+              <w:pStyle w:val="user6"/>
               <w:spacing w:before="0" w:after="160"/>
               <w:jc w:val="center"/>
               <w:rPr>
@@ -4323,7 +4306,7 @@
         </w:tc>
         <w:tc>
           <w:tcPr>
-            <w:tcW w:w="1922" w:type="dxa"/>
+            <w:tcW w:w="1921" w:type="dxa"/>
             <w:tcBorders>
               <w:top w:val="single" w:sz="4" w:space="0" w:color="000000"/>
               <w:left w:val="single" w:sz="4" w:space="0" w:color="000000"/>
@@ -4334,7 +4317,7 @@
           </w:tcPr>
           <w:p>
             <w:pPr>
-              <w:pStyle w:val="Style21"/>
+              <w:pStyle w:val="user6"/>
               <w:spacing w:before="0" w:after="160"/>
               <w:jc w:val="center"/>
               <w:rPr>
@@ -4355,7 +4338,7 @@
         </w:tc>
         <w:tc>
           <w:tcPr>
-            <w:tcW w:w="1594" w:type="dxa"/>
+            <w:tcW w:w="1595" w:type="dxa"/>
             <w:tcBorders>
               <w:top w:val="single" w:sz="4" w:space="0" w:color="000000"/>
               <w:left w:val="single" w:sz="4" w:space="0" w:color="000000"/>
@@ -4366,7 +4349,7 @@
           </w:tcPr>
           <w:p>
             <w:pPr>
-              <w:pStyle w:val="Style21"/>
+              <w:pStyle w:val="user6"/>
               <w:spacing w:before="0" w:after="160"/>
               <w:jc w:val="center"/>
               <w:rPr>
@@ -4398,7 +4381,7 @@
           </w:tcPr>
           <w:p>
             <w:pPr>
-              <w:pStyle w:val="Style21"/>
+              <w:pStyle w:val="user6"/>
               <w:spacing w:before="0" w:after="160"/>
               <w:jc w:val="center"/>
               <w:rPr>
@@ -4433,7 +4416,7 @@
           </w:tcPr>
           <w:p>
             <w:pPr>
-              <w:pStyle w:val="Style21"/>
+              <w:pStyle w:val="user6"/>
               <w:spacing w:before="0" w:after="160"/>
               <w:jc w:val="both"/>
               <w:rPr>
@@ -4465,7 +4448,7 @@
           </w:tcPr>
           <w:p>
             <w:pPr>
-              <w:pStyle w:val="Style21"/>
+              <w:pStyle w:val="user6"/>
               <w:spacing w:before="0" w:after="160"/>
               <w:jc w:val="center"/>
               <w:rPr>
@@ -4486,7 +4469,7 @@
         </w:tc>
         <w:tc>
           <w:tcPr>
-            <w:tcW w:w="1922" w:type="dxa"/>
+            <w:tcW w:w="1921" w:type="dxa"/>
             <w:tcBorders>
               <w:top w:val="single" w:sz="4" w:space="0" w:color="000000"/>
               <w:left w:val="single" w:sz="4" w:space="0" w:color="000000"/>
@@ -4497,7 +4480,7 @@
           </w:tcPr>
           <w:p>
             <w:pPr>
-              <w:pStyle w:val="Style21"/>
+              <w:pStyle w:val="user6"/>
               <w:spacing w:before="0" w:after="160"/>
               <w:jc w:val="center"/>
               <w:rPr>
@@ -4518,7 +4501,7 @@
         </w:tc>
         <w:tc>
           <w:tcPr>
-            <w:tcW w:w="1594" w:type="dxa"/>
+            <w:tcW w:w="1595" w:type="dxa"/>
             <w:tcBorders>
               <w:top w:val="single" w:sz="4" w:space="0" w:color="000000"/>
               <w:left w:val="single" w:sz="4" w:space="0" w:color="000000"/>
@@ -4529,7 +4512,7 @@
           </w:tcPr>
           <w:p>
             <w:pPr>
-              <w:pStyle w:val="Style21"/>
+              <w:pStyle w:val="user6"/>
               <w:spacing w:before="0" w:after="160"/>
               <w:jc w:val="center"/>
               <w:rPr>
@@ -4561,7 +4544,7 @@
           </w:tcPr>
           <w:p>
             <w:pPr>
-              <w:pStyle w:val="Style21"/>
+              <w:pStyle w:val="user6"/>
               <w:spacing w:before="0" w:after="160"/>
               <w:jc w:val="center"/>
               <w:rPr>
@@ -4596,7 +4579,7 @@
           </w:tcPr>
           <w:p>
             <w:pPr>
-              <w:pStyle w:val="Style21"/>
+              <w:pStyle w:val="user6"/>
               <w:spacing w:before="0" w:after="160"/>
               <w:jc w:val="both"/>
               <w:rPr>
@@ -4628,7 +4611,7 @@
           </w:tcPr>
           <w:p>
             <w:pPr>
-              <w:pStyle w:val="Style21"/>
+              <w:pStyle w:val="user6"/>
               <w:spacing w:before="0" w:after="160"/>
               <w:jc w:val="center"/>
               <w:rPr>
@@ -4649,7 +4632,7 @@
         </w:tc>
         <w:tc>
           <w:tcPr>
-            <w:tcW w:w="1922" w:type="dxa"/>
+            <w:tcW w:w="1921" w:type="dxa"/>
             <w:tcBorders>
               <w:top w:val="single" w:sz="4" w:space="0" w:color="000000"/>
               <w:left w:val="single" w:sz="4" w:space="0" w:color="000000"/>
@@ -4660,7 +4643,7 @@
           </w:tcPr>
           <w:p>
             <w:pPr>
-              <w:pStyle w:val="Style21"/>
+              <w:pStyle w:val="user6"/>
               <w:spacing w:before="0" w:after="160"/>
               <w:jc w:val="center"/>
               <w:rPr>
@@ -4681,7 +4664,7 @@
         </w:tc>
         <w:tc>
           <w:tcPr>
-            <w:tcW w:w="1594" w:type="dxa"/>
+            <w:tcW w:w="1595" w:type="dxa"/>
             <w:tcBorders>
               <w:top w:val="single" w:sz="4" w:space="0" w:color="000000"/>
               <w:left w:val="single" w:sz="4" w:space="0" w:color="000000"/>
@@ -4692,7 +4675,7 @@
           </w:tcPr>
           <w:p>
             <w:pPr>
-              <w:pStyle w:val="Style21"/>
+              <w:pStyle w:val="user6"/>
               <w:spacing w:before="0" w:after="160"/>
               <w:jc w:val="center"/>
               <w:rPr>
@@ -4724,7 +4707,7 @@
           </w:tcPr>
           <w:p>
             <w:pPr>
-              <w:pStyle w:val="Style21"/>
+              <w:pStyle w:val="user6"/>
               <w:spacing w:before="0" w:after="160"/>
               <w:jc w:val="center"/>
               <w:rPr>
@@ -4759,7 +4742,7 @@
           </w:tcPr>
           <w:p>
             <w:pPr>
-              <w:pStyle w:val="Style21"/>
+              <w:pStyle w:val="user6"/>
               <w:spacing w:before="0" w:after="160"/>
               <w:jc w:val="both"/>
               <w:rPr>
@@ -4791,7 +4774,7 @@
           </w:tcPr>
           <w:p>
             <w:pPr>
-              <w:pStyle w:val="Style21"/>
+              <w:pStyle w:val="user6"/>
               <w:spacing w:before="0" w:after="160"/>
               <w:jc w:val="center"/>
               <w:rPr>
@@ -4812,7 +4795,7 @@
         </w:tc>
         <w:tc>
           <w:tcPr>
-            <w:tcW w:w="1922" w:type="dxa"/>
+            <w:tcW w:w="1921" w:type="dxa"/>
             <w:tcBorders>
               <w:top w:val="single" w:sz="4" w:space="0" w:color="000000"/>
               <w:left w:val="single" w:sz="4" w:space="0" w:color="000000"/>
@@ -4823,7 +4806,7 @@
           </w:tcPr>
           <w:p>
             <w:pPr>
-              <w:pStyle w:val="Style21"/>
+              <w:pStyle w:val="user6"/>
               <w:spacing w:before="0" w:after="160"/>
               <w:jc w:val="center"/>
               <w:rPr>
@@ -4844,7 +4827,7 @@
         </w:tc>
         <w:tc>
           <w:tcPr>
-            <w:tcW w:w="1594" w:type="dxa"/>
+            <w:tcW w:w="1595" w:type="dxa"/>
             <w:tcBorders>
               <w:top w:val="single" w:sz="4" w:space="0" w:color="000000"/>
               <w:left w:val="single" w:sz="4" w:space="0" w:color="000000"/>
@@ -4855,7 +4838,7 @@
           </w:tcPr>
           <w:p>
             <w:pPr>
-              <w:pStyle w:val="Style21"/>
+              <w:pStyle w:val="user6"/>
               <w:spacing w:before="0" w:after="160"/>
               <w:jc w:val="center"/>
               <w:rPr>
@@ -4887,7 +4870,7 @@
           </w:tcPr>
           <w:p>
             <w:pPr>
-              <w:pStyle w:val="Style21"/>
+              <w:pStyle w:val="user6"/>
               <w:spacing w:before="0" w:after="160"/>
               <w:jc w:val="center"/>
               <w:rPr>
@@ -4922,7 +4905,7 @@
           </w:tcPr>
           <w:p>
             <w:pPr>
-              <w:pStyle w:val="Style21"/>
+              <w:pStyle w:val="user6"/>
               <w:spacing w:before="0" w:after="160"/>
               <w:jc w:val="both"/>
               <w:rPr>
@@ -4954,7 +4937,7 @@
           </w:tcPr>
           <w:p>
             <w:pPr>
-              <w:pStyle w:val="Style21"/>
+              <w:pStyle w:val="user6"/>
               <w:spacing w:before="0" w:after="160"/>
               <w:jc w:val="center"/>
               <w:rPr>
@@ -4975,7 +4958,7 @@
         </w:tc>
         <w:tc>
           <w:tcPr>
-            <w:tcW w:w="1922" w:type="dxa"/>
+            <w:tcW w:w="1921" w:type="dxa"/>
             <w:tcBorders>
               <w:top w:val="single" w:sz="4" w:space="0" w:color="000000"/>
               <w:left w:val="single" w:sz="4" w:space="0" w:color="000000"/>
@@ -4986,7 +4969,7 @@
           </w:tcPr>
           <w:p>
             <w:pPr>
-              <w:pStyle w:val="Style21"/>
+              <w:pStyle w:val="user6"/>
               <w:spacing w:before="0" w:after="160"/>
               <w:jc w:val="center"/>
               <w:rPr>
@@ -5007,7 +4990,7 @@
         </w:tc>
         <w:tc>
           <w:tcPr>
-            <w:tcW w:w="1594" w:type="dxa"/>
+            <w:tcW w:w="1595" w:type="dxa"/>
             <w:tcBorders>
               <w:top w:val="single" w:sz="4" w:space="0" w:color="000000"/>
               <w:left w:val="single" w:sz="4" w:space="0" w:color="000000"/>
@@ -5018,7 +5001,7 @@
           </w:tcPr>
           <w:p>
             <w:pPr>
-              <w:pStyle w:val="Style21"/>
+              <w:pStyle w:val="user6"/>
               <w:spacing w:before="0" w:after="160"/>
               <w:jc w:val="center"/>
               <w:rPr>
@@ -5050,7 +5033,7 @@
           </w:tcPr>
           <w:p>
             <w:pPr>
-              <w:pStyle w:val="Style21"/>
+              <w:pStyle w:val="user6"/>
               <w:spacing w:before="0" w:after="160"/>
               <w:jc w:val="center"/>
               <w:rPr>
@@ -5785,7 +5768,7 @@
           </w:tcPr>
           <w:p>
             <w:pPr>
-              <w:pStyle w:val="Style21"/>
+              <w:pStyle w:val="user6"/>
               <w:spacing w:before="0" w:after="160"/>
               <w:jc w:val="center"/>
               <w:rPr>
@@ -5819,7 +5802,7 @@
           </w:tcPr>
           <w:p>
             <w:pPr>
-              <w:pStyle w:val="Style21"/>
+              <w:pStyle w:val="user6"/>
               <w:spacing w:before="0" w:after="160"/>
               <w:jc w:val="center"/>
               <w:rPr>
@@ -5853,7 +5836,7 @@
           </w:tcPr>
           <w:p>
             <w:pPr>
-              <w:pStyle w:val="Style21"/>
+              <w:pStyle w:val="user6"/>
               <w:spacing w:before="0" w:after="160"/>
               <w:jc w:val="center"/>
               <w:rPr>
@@ -5886,7 +5869,7 @@
           </w:tcPr>
           <w:p>
             <w:pPr>
-              <w:pStyle w:val="Style21"/>
+              <w:pStyle w:val="user6"/>
               <w:spacing w:before="0" w:after="160"/>
               <w:jc w:val="center"/>
               <w:rPr>
@@ -5924,7 +5907,7 @@
           </w:tcPr>
           <w:p>
             <w:pPr>
-              <w:pStyle w:val="Style21"/>
+              <w:pStyle w:val="user6"/>
               <w:spacing w:before="0" w:after="160"/>
               <w:jc w:val="center"/>
               <w:rPr>
@@ -5955,7 +5938,7 @@
           </w:tcPr>
           <w:p>
             <w:pPr>
-              <w:pStyle w:val="Style21"/>
+              <w:pStyle w:val="user6"/>
               <w:spacing w:before="0" w:after="160"/>
               <w:jc w:val="center"/>
               <w:rPr>
@@ -5988,7 +5971,7 @@
           </w:tcPr>
           <w:p>
             <w:pPr>
-              <w:pStyle w:val="Style21"/>
+              <w:pStyle w:val="user6"/>
               <w:spacing w:before="0" w:after="160"/>
               <w:jc w:val="center"/>
               <w:rPr>
@@ -6020,7 +6003,7 @@
           </w:tcPr>
           <w:p>
             <w:pPr>
-              <w:pStyle w:val="Style21"/>
+              <w:pStyle w:val="user6"/>
               <w:spacing w:before="0" w:after="160"/>
               <w:jc w:val="center"/>
               <w:rPr>
@@ -6056,7 +6039,7 @@
           </w:tcPr>
           <w:p>
             <w:pPr>
-              <w:pStyle w:val="Style21"/>
+              <w:pStyle w:val="user6"/>
               <w:spacing w:before="0" w:after="160"/>
               <w:jc w:val="center"/>
               <w:rPr>
@@ -6089,7 +6072,7 @@
           </w:tcPr>
           <w:p>
             <w:pPr>
-              <w:pStyle w:val="Style21"/>
+              <w:pStyle w:val="user6"/>
               <w:spacing w:before="0" w:after="160"/>
               <w:jc w:val="center"/>
               <w:rPr>
@@ -6122,7 +6105,7 @@
           </w:tcPr>
           <w:p>
             <w:pPr>
-              <w:pStyle w:val="Style21"/>
+              <w:pStyle w:val="user6"/>
               <w:spacing w:before="0" w:after="160"/>
               <w:jc w:val="center"/>
               <w:rPr>
@@ -6154,7 +6137,7 @@
           </w:tcPr>
           <w:p>
             <w:pPr>
-              <w:pStyle w:val="Style21"/>
+              <w:pStyle w:val="user6"/>
               <w:spacing w:before="0" w:after="160"/>
               <w:jc w:val="center"/>
               <w:rPr>
@@ -6190,7 +6173,7 @@
           </w:tcPr>
           <w:p>
             <w:pPr>
-              <w:pStyle w:val="Style21"/>
+              <w:pStyle w:val="user6"/>
               <w:spacing w:before="0" w:after="160"/>
               <w:jc w:val="center"/>
               <w:rPr>
@@ -6223,7 +6206,7 @@
           </w:tcPr>
           <w:p>
             <w:pPr>
-              <w:pStyle w:val="Style21"/>
+              <w:pStyle w:val="user6"/>
               <w:spacing w:before="0" w:after="160"/>
               <w:jc w:val="center"/>
               <w:rPr>
@@ -6256,7 +6239,7 @@
           </w:tcPr>
           <w:p>
             <w:pPr>
-              <w:pStyle w:val="Style21"/>
+              <w:pStyle w:val="user6"/>
               <w:spacing w:before="0" w:after="160"/>
               <w:jc w:val="center"/>
               <w:rPr>
@@ -6288,7 +6271,7 @@
           </w:tcPr>
           <w:p>
             <w:pPr>
-              <w:pStyle w:val="Style21"/>
+              <w:pStyle w:val="user6"/>
               <w:spacing w:before="0" w:after="160"/>
               <w:jc w:val="center"/>
               <w:rPr>
@@ -6324,7 +6307,7 @@
           </w:tcPr>
           <w:p>
             <w:pPr>
-              <w:pStyle w:val="Style21"/>
+              <w:pStyle w:val="user6"/>
               <w:spacing w:before="0" w:after="160"/>
               <w:jc w:val="center"/>
               <w:rPr>
@@ -6357,7 +6340,7 @@
           </w:tcPr>
           <w:p>
             <w:pPr>
-              <w:pStyle w:val="Style21"/>
+              <w:pStyle w:val="user6"/>
               <w:spacing w:before="0" w:after="160"/>
               <w:jc w:val="center"/>
               <w:rPr>
@@ -6390,7 +6373,7 @@
           </w:tcPr>
           <w:p>
             <w:pPr>
-              <w:pStyle w:val="Style21"/>
+              <w:pStyle w:val="user6"/>
               <w:spacing w:before="0" w:after="160"/>
               <w:jc w:val="center"/>
               <w:rPr>
@@ -6422,7 +6405,7 @@
           </w:tcPr>
           <w:p>
             <w:pPr>
-              <w:pStyle w:val="Style21"/>
+              <w:pStyle w:val="user6"/>
               <w:spacing w:before="0" w:after="160"/>
               <w:jc w:val="center"/>
               <w:rPr>
@@ -6460,7 +6443,7 @@
           </w:tcPr>
           <w:p>
             <w:pPr>
-              <w:pStyle w:val="Style21"/>
+              <w:pStyle w:val="user6"/>
               <w:spacing w:before="0" w:after="160"/>
               <w:jc w:val="center"/>
               <w:rPr>
@@ -6491,7 +6474,7 @@
           </w:tcPr>
           <w:p>
             <w:pPr>
-              <w:pStyle w:val="Style21"/>
+              <w:pStyle w:val="user6"/>
               <w:spacing w:before="0" w:after="160"/>
               <w:jc w:val="center"/>
               <w:rPr>
@@ -6524,7 +6507,7 @@
           </w:tcPr>
           <w:p>
             <w:pPr>
-              <w:pStyle w:val="Style21"/>
+              <w:pStyle w:val="user6"/>
               <w:spacing w:before="0" w:after="160"/>
               <w:jc w:val="center"/>
               <w:rPr>
@@ -6556,7 +6539,7 @@
           </w:tcPr>
           <w:p>
             <w:pPr>
-              <w:pStyle w:val="Style21"/>
+              <w:pStyle w:val="user6"/>
               <w:spacing w:before="0" w:after="160"/>
               <w:jc w:val="center"/>
               <w:rPr>
@@ -6593,7 +6576,7 @@
           </w:tcPr>
           <w:p>
             <w:pPr>
-              <w:pStyle w:val="Style21"/>
+              <w:pStyle w:val="user6"/>
               <w:spacing w:before="0" w:after="160"/>
               <w:jc w:val="center"/>
               <w:rPr>
@@ -6623,7 +6606,7 @@
           </w:tcPr>
           <w:p>
             <w:pPr>
-              <w:pStyle w:val="Style21"/>
+              <w:pStyle w:val="user6"/>
               <w:spacing w:before="0" w:after="160"/>
               <w:jc w:val="center"/>
               <w:rPr>
@@ -6655,7 +6638,7 @@
           </w:tcPr>
           <w:p>
             <w:pPr>
-              <w:pStyle w:val="Style21"/>
+              <w:pStyle w:val="user6"/>
               <w:spacing w:before="0" w:after="160"/>
               <w:jc w:val="center"/>
               <w:rPr>
@@ -6686,7 +6669,7 @@
           </w:tcPr>
           <w:p>
             <w:pPr>
-              <w:pStyle w:val="Style21"/>
+              <w:pStyle w:val="user6"/>
               <w:spacing w:before="0" w:after="160"/>
               <w:jc w:val="center"/>
               <w:rPr>
@@ -6723,7 +6706,7 @@
           </w:tcPr>
           <w:p>
             <w:pPr>
-              <w:pStyle w:val="Style21"/>
+              <w:pStyle w:val="user6"/>
               <w:spacing w:before="0" w:after="160"/>
               <w:jc w:val="center"/>
               <w:rPr>
@@ -6754,7 +6737,7 @@
           </w:tcPr>
           <w:p>
             <w:pPr>
-              <w:pStyle w:val="Style21"/>
+              <w:pStyle w:val="user6"/>
               <w:spacing w:before="0" w:after="160"/>
               <w:jc w:val="center"/>
               <w:rPr>
@@ -6787,7 +6770,7 @@
           </w:tcPr>
           <w:p>
             <w:pPr>
-              <w:pStyle w:val="Style21"/>
+              <w:pStyle w:val="user6"/>
               <w:spacing w:before="0" w:after="160"/>
               <w:jc w:val="center"/>
               <w:rPr>
@@ -6820,7 +6803,7 @@
           </w:tcPr>
           <w:p>
             <w:pPr>
-              <w:pStyle w:val="Style21"/>
+              <w:pStyle w:val="user6"/>
               <w:spacing w:before="0" w:after="160"/>
               <w:jc w:val="center"/>
               <w:rPr>
@@ -6857,7 +6840,7 @@
           </w:tcPr>
           <w:p>
             <w:pPr>
-              <w:pStyle w:val="Style21"/>
+              <w:pStyle w:val="user6"/>
               <w:spacing w:before="0" w:after="160"/>
               <w:jc w:val="center"/>
               <w:rPr>
@@ -6888,7 +6871,7 @@
           </w:tcPr>
           <w:p>
             <w:pPr>
-              <w:pStyle w:val="Style21"/>
+              <w:pStyle w:val="user6"/>
               <w:spacing w:before="0" w:after="160"/>
               <w:jc w:val="center"/>
               <w:rPr>
@@ -6921,7 +6904,7 @@
           </w:tcPr>
           <w:p>
             <w:pPr>
-              <w:pStyle w:val="Style21"/>
+              <w:pStyle w:val="user6"/>
               <w:spacing w:before="0" w:after="160"/>
               <w:jc w:val="center"/>
               <w:rPr>
@@ -6954,7 +6937,7 @@
           </w:tcPr>
           <w:p>
             <w:pPr>
-              <w:pStyle w:val="Style21"/>
+              <w:pStyle w:val="user6"/>
               <w:spacing w:before="0" w:after="160"/>
               <w:jc w:val="center"/>
               <w:rPr>
@@ -6991,7 +6974,7 @@
           </w:tcPr>
           <w:p>
             <w:pPr>
-              <w:pStyle w:val="Style21"/>
+              <w:pStyle w:val="user6"/>
               <w:spacing w:before="0" w:after="160"/>
               <w:jc w:val="center"/>
               <w:rPr>
@@ -7022,7 +7005,7 @@
           </w:tcPr>
           <w:p>
             <w:pPr>
-              <w:pStyle w:val="Style21"/>
+              <w:pStyle w:val="user6"/>
               <w:spacing w:before="0" w:after="160"/>
               <w:jc w:val="center"/>
               <w:rPr>
@@ -7055,7 +7038,7 @@
           </w:tcPr>
           <w:p>
             <w:pPr>
-              <w:pStyle w:val="Style21"/>
+              <w:pStyle w:val="user6"/>
               <w:spacing w:before="0" w:after="160"/>
               <w:jc w:val="center"/>
               <w:rPr>
@@ -7088,7 +7071,7 @@
           </w:tcPr>
           <w:p>
             <w:pPr>
-              <w:pStyle w:val="Style21"/>
+              <w:pStyle w:val="user6"/>
               <w:spacing w:before="0" w:after="160"/>
               <w:jc w:val="center"/>
               <w:rPr>
@@ -7125,7 +7108,7 @@
           </w:tcPr>
           <w:p>
             <w:pPr>
-              <w:pStyle w:val="Style21"/>
+              <w:pStyle w:val="user6"/>
               <w:spacing w:before="0" w:after="160"/>
               <w:jc w:val="center"/>
               <w:rPr>
@@ -7156,7 +7139,7 @@
           </w:tcPr>
           <w:p>
             <w:pPr>
-              <w:pStyle w:val="Style21"/>
+              <w:pStyle w:val="user6"/>
               <w:spacing w:before="0" w:after="160"/>
               <w:jc w:val="center"/>
               <w:rPr>
@@ -7189,7 +7172,7 @@
           </w:tcPr>
           <w:p>
             <w:pPr>
-              <w:pStyle w:val="Style21"/>
+              <w:pStyle w:val="user6"/>
               <w:spacing w:before="0" w:after="160"/>
               <w:jc w:val="center"/>
               <w:rPr>
@@ -7222,7 +7205,7 @@
           </w:tcPr>
           <w:p>
             <w:pPr>
-              <w:pStyle w:val="Style21"/>
+              <w:pStyle w:val="user6"/>
               <w:spacing w:before="0" w:after="160"/>
               <w:jc w:val="center"/>
               <w:rPr>
@@ -7259,7 +7242,7 @@
           </w:tcPr>
           <w:p>
             <w:pPr>
-              <w:pStyle w:val="Style21"/>
+              <w:pStyle w:val="user6"/>
               <w:spacing w:before="0" w:after="160"/>
               <w:jc w:val="center"/>
               <w:rPr>
@@ -7290,7 +7273,7 @@
           </w:tcPr>
           <w:p>
             <w:pPr>
-              <w:pStyle w:val="Style21"/>
+              <w:pStyle w:val="user6"/>
               <w:spacing w:before="0" w:after="160"/>
               <w:jc w:val="center"/>
               <w:rPr>
@@ -7323,7 +7306,7 @@
           </w:tcPr>
           <w:p>
             <w:pPr>
-              <w:pStyle w:val="Style21"/>
+              <w:pStyle w:val="user6"/>
               <w:spacing w:before="0" w:after="160"/>
               <w:jc w:val="center"/>
               <w:rPr>
@@ -7549,7 +7532,7 @@
       </w:r>
       <w:r>
         <w:rPr>
-          <w:rStyle w:val="user4"/>
+          <w:rStyle w:val="Style19"/>
           <w:rFonts w:ascii="Liberation Serif" w:hAnsi="Liberation Serif"/>
           <w:b w:val="false"/>
           <w:bCs w:val="false"/>
@@ -7578,7 +7561,7 @@
       </w:r>
       <w:r>
         <w:rPr>
-          <w:rStyle w:val="user4"/>
+          <w:rStyle w:val="Style19"/>
           <w:rFonts w:ascii="Liberation Serif" w:hAnsi="Liberation Serif"/>
           <w:b w:val="false"/>
           <w:bCs w:val="false"/>
@@ -7645,7 +7628,7 @@
       </w:r>
       <w:r>
         <w:rPr>
-          <w:rStyle w:val="user4"/>
+          <w:rStyle w:val="Style19"/>
           <w:rFonts w:ascii="Liberation Serif" w:hAnsi="Liberation Serif"/>
           <w:b w:val="false"/>
           <w:bCs w:val="false"/>
@@ -7674,7 +7657,7 @@
       </w:r>
       <w:r>
         <w:rPr>
-          <w:rStyle w:val="user4"/>
+          <w:rStyle w:val="Style19"/>
           <w:rFonts w:ascii="Liberation Serif" w:hAnsi="Liberation Serif"/>
           <w:b w:val="false"/>
           <w:bCs w:val="false"/>
@@ -7869,7 +7852,7 @@
           </w:tcPr>
           <w:p>
             <w:pPr>
-              <w:pStyle w:val="user8"/>
+              <w:pStyle w:val="Style23"/>
               <w:spacing w:before="0" w:after="160"/>
               <w:jc w:val="center"/>
               <w:rPr>
@@ -7906,7 +7889,7 @@
           </w:tcPr>
           <w:p>
             <w:pPr>
-              <w:pStyle w:val="user8"/>
+              <w:pStyle w:val="Style23"/>
               <w:spacing w:before="0" w:after="160"/>
               <w:jc w:val="center"/>
               <w:rPr>
@@ -7944,7 +7927,7 @@
           </w:tcPr>
           <w:p>
             <w:pPr>
-              <w:pStyle w:val="user8"/>
+              <w:pStyle w:val="Style23"/>
               <w:spacing w:before="0" w:after="160"/>
               <w:jc w:val="center"/>
               <w:rPr>
@@ -7984,7 +7967,7 @@
           </w:tcPr>
           <w:p>
             <w:pPr>
-              <w:pStyle w:val="user8"/>
+              <w:pStyle w:val="Style23"/>
               <w:spacing w:before="0" w:after="160"/>
               <w:jc w:val="center"/>
               <w:rPr>
@@ -8018,7 +8001,7 @@
           </w:tcPr>
           <w:p>
             <w:pPr>
-              <w:pStyle w:val="user8"/>
+              <w:pStyle w:val="Style23"/>
               <w:spacing w:before="0" w:after="160"/>
               <w:jc w:val="center"/>
               <w:rPr>
@@ -8053,7 +8036,7 @@
           </w:tcPr>
           <w:p>
             <w:pPr>
-              <w:pStyle w:val="user8"/>
+              <w:pStyle w:val="Style23"/>
               <w:spacing w:before="0" w:after="160"/>
               <w:jc w:val="center"/>
               <w:rPr>
@@ -8092,14 +8075,14 @@
           </w:tcPr>
           <w:p>
             <w:pPr>
-              <w:pStyle w:val="user8"/>
+              <w:pStyle w:val="Style23"/>
               <w:spacing w:before="0" w:after="160"/>
               <w:jc w:val="center"/>
               <w:rPr/>
             </w:pPr>
             <w:r>
               <w:rPr>
-                <w:rStyle w:val="user4"/>
+                <w:rStyle w:val="Style19"/>
                 <w:rFonts w:ascii="Liberation Serif" w:hAnsi="Liberation Serif"/>
                 <w:b w:val="false"/>
                 <w:bCs w:val="false"/>
@@ -8124,7 +8107,7 @@
           </w:tcPr>
           <w:p>
             <w:pPr>
-              <w:pStyle w:val="user8"/>
+              <w:pStyle w:val="Style23"/>
               <w:spacing w:before="0" w:after="160"/>
               <w:jc w:val="center"/>
               <w:rPr>
@@ -8159,7 +8142,7 @@
           </w:tcPr>
           <w:p>
             <w:pPr>
-              <w:pStyle w:val="user8"/>
+              <w:pStyle w:val="Style23"/>
               <w:spacing w:before="0" w:after="160"/>
               <w:jc w:val="center"/>
               <w:rPr>
@@ -8198,14 +8181,14 @@
           </w:tcPr>
           <w:p>
             <w:pPr>
-              <w:pStyle w:val="user8"/>
+              <w:pStyle w:val="Style23"/>
               <w:spacing w:before="0" w:after="160"/>
               <w:jc w:val="center"/>
               <w:rPr/>
             </w:pPr>
             <w:r>
               <w:rPr>
-                <w:rStyle w:val="user4"/>
+                <w:rStyle w:val="Style19"/>
                 <w:rFonts w:ascii="Liberation Serif" w:hAnsi="Liberation Serif"/>
                 <w:b w:val="false"/>
                 <w:bCs w:val="false"/>
@@ -8230,7 +8213,7 @@
           </w:tcPr>
           <w:p>
             <w:pPr>
-              <w:pStyle w:val="user8"/>
+              <w:pStyle w:val="Style23"/>
               <w:spacing w:before="0" w:after="160"/>
               <w:jc w:val="center"/>
               <w:rPr>
@@ -8265,7 +8248,7 @@
           </w:tcPr>
           <w:p>
             <w:pPr>
-              <w:pStyle w:val="user8"/>
+              <w:pStyle w:val="Style23"/>
               <w:spacing w:before="0" w:after="160"/>
               <w:jc w:val="center"/>
               <w:rPr>
@@ -8304,14 +8287,14 @@
           </w:tcPr>
           <w:p>
             <w:pPr>
-              <w:pStyle w:val="user8"/>
+              <w:pStyle w:val="Style23"/>
               <w:spacing w:before="0" w:after="160"/>
               <w:jc w:val="center"/>
               <w:rPr/>
             </w:pPr>
             <w:r>
               <w:rPr>
-                <w:rStyle w:val="user4"/>
+                <w:rStyle w:val="Style19"/>
                 <w:rFonts w:ascii="Liberation Serif" w:hAnsi="Liberation Serif"/>
                 <w:b w:val="false"/>
                 <w:bCs w:val="false"/>
@@ -8336,7 +8319,7 @@
           </w:tcPr>
           <w:p>
             <w:pPr>
-              <w:pStyle w:val="user8"/>
+              <w:pStyle w:val="Style23"/>
               <w:spacing w:before="0" w:after="160"/>
               <w:jc w:val="center"/>
               <w:rPr>
@@ -8371,7 +8354,7 @@
           </w:tcPr>
           <w:p>
             <w:pPr>
-              <w:pStyle w:val="user8"/>
+              <w:pStyle w:val="Style23"/>
               <w:spacing w:before="0" w:after="160"/>
               <w:jc w:val="center"/>
               <w:rPr>
@@ -8410,14 +8393,14 @@
           </w:tcPr>
           <w:p>
             <w:pPr>
-              <w:pStyle w:val="user8"/>
+              <w:pStyle w:val="Style23"/>
               <w:spacing w:before="0" w:after="160"/>
               <w:jc w:val="center"/>
               <w:rPr/>
             </w:pPr>
             <w:r>
               <w:rPr>
-                <w:rStyle w:val="user4"/>
+                <w:rStyle w:val="Style19"/>
                 <w:rFonts w:ascii="Liberation Serif" w:hAnsi="Liberation Serif"/>
                 <w:b w:val="false"/>
                 <w:bCs w:val="false"/>
@@ -8442,7 +8425,7 @@
           </w:tcPr>
           <w:p>
             <w:pPr>
-              <w:pStyle w:val="user8"/>
+              <w:pStyle w:val="Style23"/>
               <w:spacing w:before="0" w:after="160"/>
               <w:jc w:val="center"/>
               <w:rPr>
@@ -8477,7 +8460,7 @@
           </w:tcPr>
           <w:p>
             <w:pPr>
-              <w:pStyle w:val="user8"/>
+              <w:pStyle w:val="Style23"/>
               <w:spacing w:before="0" w:after="160"/>
               <w:jc w:val="center"/>
               <w:rPr>
@@ -8516,14 +8499,14 @@
           </w:tcPr>
           <w:p>
             <w:pPr>
-              <w:pStyle w:val="user8"/>
+              <w:pStyle w:val="Style23"/>
               <w:spacing w:before="0" w:after="160"/>
               <w:jc w:val="center"/>
               <w:rPr/>
             </w:pPr>
             <w:r>
               <w:rPr>
-                <w:rStyle w:val="user4"/>
+                <w:rStyle w:val="Style19"/>
                 <w:rFonts w:ascii="Liberation Serif" w:hAnsi="Liberation Serif"/>
                 <w:b w:val="false"/>
                 <w:bCs w:val="false"/>
@@ -8548,7 +8531,7 @@
           </w:tcPr>
           <w:p>
             <w:pPr>
-              <w:pStyle w:val="user8"/>
+              <w:pStyle w:val="Style23"/>
               <w:spacing w:before="0" w:after="160"/>
               <w:jc w:val="center"/>
               <w:rPr>
@@ -8583,7 +8566,7 @@
           </w:tcPr>
           <w:p>
             <w:pPr>
-              <w:pStyle w:val="user8"/>
+              <w:pStyle w:val="Style23"/>
               <w:spacing w:before="0" w:after="160"/>
               <w:jc w:val="center"/>
               <w:rPr>
@@ -8664,7 +8647,7 @@
           </w:tcPr>
           <w:p>
             <w:pPr>
-              <w:pStyle w:val="user8"/>
+              <w:pStyle w:val="Style23"/>
               <w:spacing w:before="0" w:after="160"/>
               <w:jc w:val="center"/>
               <w:rPr>
@@ -8701,7 +8684,7 @@
           </w:tcPr>
           <w:p>
             <w:pPr>
-              <w:pStyle w:val="user8"/>
+              <w:pStyle w:val="Style23"/>
               <w:spacing w:before="0" w:after="160"/>
               <w:jc w:val="center"/>
               <w:rPr>
@@ -8739,7 +8722,7 @@
           </w:tcPr>
           <w:p>
             <w:pPr>
-              <w:pStyle w:val="user8"/>
+              <w:pStyle w:val="Style23"/>
               <w:spacing w:before="0" w:after="160"/>
               <w:jc w:val="center"/>
               <w:rPr>
@@ -8779,14 +8762,14 @@
           </w:tcPr>
           <w:p>
             <w:pPr>
-              <w:pStyle w:val="user8"/>
+              <w:pStyle w:val="Style23"/>
               <w:spacing w:before="0" w:after="160"/>
               <w:jc w:val="center"/>
               <w:rPr/>
             </w:pPr>
             <w:r>
               <w:rPr>
-                <w:rStyle w:val="user4"/>
+                <w:rStyle w:val="Style19"/>
                 <w:rFonts w:ascii="Liberation Serif" w:hAnsi="Liberation Serif"/>
                 <w:b w:val="false"/>
                 <w:bCs w:val="false"/>
@@ -8811,7 +8794,7 @@
           </w:tcPr>
           <w:p>
             <w:pPr>
-              <w:pStyle w:val="user8"/>
+              <w:pStyle w:val="Style23"/>
               <w:spacing w:before="0" w:after="160"/>
               <w:jc w:val="center"/>
               <w:rPr>
@@ -8846,7 +8829,7 @@
           </w:tcPr>
           <w:p>
             <w:pPr>
-              <w:pStyle w:val="user8"/>
+              <w:pStyle w:val="Style23"/>
               <w:spacing w:before="0" w:after="160"/>
               <w:jc w:val="center"/>
               <w:rPr>
@@ -8885,14 +8868,14 @@
           </w:tcPr>
           <w:p>
             <w:pPr>
-              <w:pStyle w:val="user8"/>
+              <w:pStyle w:val="Style23"/>
               <w:spacing w:before="0" w:after="160"/>
               <w:jc w:val="center"/>
               <w:rPr/>
             </w:pPr>
             <w:r>
               <w:rPr>
-                <w:rStyle w:val="user4"/>
+                <w:rStyle w:val="Style19"/>
                 <w:rFonts w:ascii="Liberation Serif" w:hAnsi="Liberation Serif"/>
                 <w:b w:val="false"/>
                 <w:bCs w:val="false"/>
@@ -8917,7 +8900,7 @@
           </w:tcPr>
           <w:p>
             <w:pPr>
-              <w:pStyle w:val="user8"/>
+              <w:pStyle w:val="Style23"/>
               <w:spacing w:before="0" w:after="160"/>
               <w:jc w:val="center"/>
               <w:rPr>
@@ -8952,7 +8935,7 @@
           </w:tcPr>
           <w:p>
             <w:pPr>
-              <w:pStyle w:val="user8"/>
+              <w:pStyle w:val="Style23"/>
               <w:spacing w:before="0" w:after="160"/>
               <w:jc w:val="center"/>
               <w:rPr>
@@ -8991,14 +8974,14 @@
           </w:tcPr>
           <w:p>
             <w:pPr>
-              <w:pStyle w:val="user8"/>
+              <w:pStyle w:val="Style23"/>
               <w:spacing w:before="0" w:after="160"/>
               <w:jc w:val="center"/>
               <w:rPr/>
             </w:pPr>
             <w:r>
               <w:rPr>
-                <w:rStyle w:val="user4"/>
+                <w:rStyle w:val="Style19"/>
                 <w:rFonts w:ascii="Liberation Serif" w:hAnsi="Liberation Serif"/>
                 <w:b w:val="false"/>
                 <w:bCs w:val="false"/>
@@ -9023,7 +9006,7 @@
           </w:tcPr>
           <w:p>
             <w:pPr>
-              <w:pStyle w:val="user8"/>
+              <w:pStyle w:val="Style23"/>
               <w:spacing w:before="0" w:after="160"/>
               <w:jc w:val="center"/>
               <w:rPr>
@@ -9058,7 +9041,7 @@
           </w:tcPr>
           <w:p>
             <w:pPr>
-              <w:pStyle w:val="user8"/>
+              <w:pStyle w:val="Style23"/>
               <w:spacing w:before="0" w:after="160"/>
               <w:jc w:val="center"/>
               <w:rPr>
@@ -9097,14 +9080,14 @@
           </w:tcPr>
           <w:p>
             <w:pPr>
-              <w:pStyle w:val="user8"/>
+              <w:pStyle w:val="Style23"/>
               <w:spacing w:before="0" w:after="160"/>
               <w:jc w:val="center"/>
               <w:rPr/>
             </w:pPr>
             <w:r>
               <w:rPr>
-                <w:rStyle w:val="user4"/>
+                <w:rStyle w:val="Style19"/>
                 <w:rFonts w:ascii="Liberation Serif" w:hAnsi="Liberation Serif"/>
                 <w:b w:val="false"/>
                 <w:bCs w:val="false"/>
@@ -9129,7 +9112,7 @@
           </w:tcPr>
           <w:p>
             <w:pPr>
-              <w:pStyle w:val="user8"/>
+              <w:pStyle w:val="Style23"/>
               <w:spacing w:before="0" w:after="160"/>
               <w:jc w:val="center"/>
               <w:rPr>
@@ -9164,7 +9147,7 @@
           </w:tcPr>
           <w:p>
             <w:pPr>
-              <w:pStyle w:val="user8"/>
+              <w:pStyle w:val="Style23"/>
               <w:spacing w:before="0" w:after="160"/>
               <w:jc w:val="center"/>
               <w:rPr>
@@ -9203,14 +9186,14 @@
           </w:tcPr>
           <w:p>
             <w:pPr>
-              <w:pStyle w:val="user8"/>
+              <w:pStyle w:val="Style23"/>
               <w:spacing w:before="0" w:after="160"/>
               <w:jc w:val="center"/>
               <w:rPr/>
             </w:pPr>
             <w:r>
               <w:rPr>
-                <w:rStyle w:val="user4"/>
+                <w:rStyle w:val="Style19"/>
                 <w:rFonts w:ascii="Liberation Serif" w:hAnsi="Liberation Serif"/>
                 <w:b w:val="false"/>
                 <w:bCs w:val="false"/>
@@ -9235,7 +9218,7 @@
           </w:tcPr>
           <w:p>
             <w:pPr>
-              <w:pStyle w:val="user8"/>
+              <w:pStyle w:val="Style23"/>
               <w:spacing w:before="0" w:after="160"/>
               <w:jc w:val="center"/>
               <w:rPr>
@@ -9270,7 +9253,7 @@
           </w:tcPr>
           <w:p>
             <w:pPr>
-              <w:pStyle w:val="user8"/>
+              <w:pStyle w:val="Style23"/>
               <w:spacing w:before="0" w:after="160"/>
               <w:jc w:val="center"/>
               <w:rPr>
@@ -9368,7 +9351,7 @@
       </w:r>
       <w:r>
         <w:rPr>
-          <w:rStyle w:val="user4"/>
+          <w:rStyle w:val="Style19"/>
           <w:rFonts w:ascii="Liberation Serif" w:hAnsi="Liberation Serif"/>
           <w:b w:val="false"/>
           <w:bCs w:val="false"/>
@@ -9451,7 +9434,7 @@
       </w:r>
       <w:r>
         <w:rPr>
-          <w:rStyle w:val="user4"/>
+          <w:rStyle w:val="Style19"/>
           <w:rFonts w:ascii="Liberation Serif" w:hAnsi="Liberation Serif"/>
           <w:b w:val="false"/>
           <w:bCs w:val="false"/>
@@ -9502,7 +9485,7 @@
       </w:r>
       <w:r>
         <w:rPr>
-          <w:rStyle w:val="user4"/>
+          <w:rStyle w:val="Style19"/>
           <w:rFonts w:ascii="Liberation Serif" w:hAnsi="Liberation Serif"/>
           <w:b w:val="false"/>
           <w:bCs w:val="false"/>
@@ -9614,57 +9597,19 @@
       <w:pPr>
         <w:pStyle w:val="Normal"/>
         <w:spacing w:lineRule="auto" w:line="360" w:before="0" w:after="0"/>
-        <w:jc w:val="both"/>
-        <w:rPr>
-          <w:rFonts w:ascii="Liberation Serif" w:hAnsi="Liberation Serif"/>
-          <w:color w:val="FFFFFF"/>
-          <w:sz w:val="28"/>
-          <w:szCs w:val="28"/>
-        </w:rPr>
-      </w:pPr>
-      <w:r>
-        <w:rPr>
-          <w:rFonts w:ascii="Liberation Serif" w:hAnsi="Liberation Serif"/>
-          <w:b/>
-          <w:bCs/>
-          <w:color w:val="FFFFFF"/>
-          <w:sz w:val="28"/>
-          <w:szCs w:val="28"/>
-        </w:rPr>
-        <w:t>2.</w:t>
-      </w:r>
-      <w:r>
-        <w:rPr>
-          <w:rFonts w:ascii="Liberation Serif" w:hAnsi="Liberation Serif"/>
-          <w:b/>
-          <w:bCs/>
-          <w:color w:val="FFFFFF"/>
-          <w:sz w:val="28"/>
-          <w:szCs w:val="28"/>
-        </w:rPr>
-        <w:t>2</w:t>
-      </w:r>
-      <w:r>
-        <w:rPr>
-          <w:rFonts w:ascii="Liberation Serif" w:hAnsi="Liberation Serif"/>
-          <w:b/>
-          <w:bCs/>
-          <w:color w:val="FFFFFF"/>
-          <w:sz w:val="28"/>
-          <w:szCs w:val="28"/>
-        </w:rPr>
-        <w:t xml:space="preserve"> </w:t>
-      </w:r>
-      <w:r>
-        <w:rPr>
-          <w:rFonts w:ascii="Liberation Serif" w:hAnsi="Liberation Serif"/>
-          <w:b/>
-          <w:bCs/>
-          <w:color w:val="FFFFFF"/>
-          <w:sz w:val="28"/>
-          <w:szCs w:val="28"/>
-        </w:rPr>
-        <w:t>Ядро платформы</w:t>
+        <w:jc w:val="center"/>
+        <w:rPr/>
+      </w:pPr>
+      <w:r>
+        <w:rPr>
+          <w:rFonts w:ascii="Liberation Serif" w:hAnsi="Liberation Serif"/>
+          <w:b/>
+          <w:bCs/>
+          <w:color w:val="FFFFFF"/>
+          <w:sz w:val="28"/>
+          <w:szCs w:val="28"/>
+        </w:rPr>
+        <w:t>2.2 Ядро платформы</w:t>
       </w:r>
     </w:p>
     <w:p>
@@ -9684,78 +9629,25 @@
       <w:r>
         <w:rPr>
           <w:rFonts w:ascii="Liberation Serif" w:hAnsi="Liberation Serif"/>
-          <w:b w:val="false"/>
-          <w:bCs w:val="false"/>
-          <w:color w:val="FFFFFF"/>
-          <w:sz w:val="28"/>
-          <w:szCs w:val="28"/>
-        </w:rPr>
-        <w:tab/>
-        <w:t>Ядро платформы включает три компонента, непосредственно реализующих бизнес-логику и пользовательское взаимодействие: клиентское приложение (фронтенд), серверное приложение (бэкенд) и реляционная база данных. Эти компоненты образуют классическую трёхзвенную архитектуру, в которой каждый уровень отвечает за свою область ответственности.</w:t>
-      </w:r>
-    </w:p>
-    <w:p>
-      <w:pPr>
-        <w:pStyle w:val="BodyText"/>
-        <w:spacing w:lineRule="auto" w:line="360"/>
-        <w:jc w:val="both"/>
-        <w:rPr>
-          <w:rFonts w:ascii="Liberation Serif" w:hAnsi="Liberation Serif"/>
-          <w:color w:val="FFFFFF"/>
-          <w:sz w:val="28"/>
-          <w:szCs w:val="28"/>
-        </w:rPr>
-      </w:pPr>
-      <w:r>
-        <w:rPr>
-          <w:rFonts w:ascii="Liberation Serif" w:hAnsi="Liberation Serif"/>
-          <w:color w:val="FFFFFF"/>
-          <w:sz w:val="28"/>
-          <w:szCs w:val="28"/>
-        </w:rPr>
-        <w:tab/>
-        <w:t>Серверное приложение реализовано на языке Java с использованием фреймворка Spring Boot и является центральным компонентом платформы, координирующим работу всех остальных сервисов. Бэкенд предоставляет REST API для клиентского приложения, управляет данными в базе данных, интегрируется с GitLab, SonarQube, Nexus и HashiCorp Vault.</w:t>
-      </w:r>
-    </w:p>
-    <w:p>
-      <w:pPr>
-        <w:pStyle w:val="BodyText"/>
-        <w:spacing w:lineRule="auto" w:line="360"/>
-        <w:jc w:val="both"/>
-        <w:rPr>
-          <w:rFonts w:ascii="Liberation Serif" w:hAnsi="Liberation Serif"/>
-          <w:color w:val="FFFFFF"/>
-          <w:sz w:val="28"/>
-          <w:szCs w:val="28"/>
-        </w:rPr>
-      </w:pPr>
-      <w:r>
-        <w:rPr>
-          <w:rFonts w:ascii="Liberation Serif" w:hAnsi="Liberation Serif"/>
-          <w:color w:val="FFFFFF"/>
-          <w:sz w:val="28"/>
-          <w:szCs w:val="28"/>
-        </w:rPr>
-        <w:tab/>
-        <w:t>Приложение спроектировано по принципу многослойной архитектуры (layered architecture). Зависимости между слоями направлены строго сверху вниз: верхний слой может обращаться к нижнему, но не наоборот. Такой подход обеспечивает разделение ответственности, тестируемость каждого слоя в изоляции и возможность замены реализации на любом уровне без влияния на остальные.</w:t>
-      </w:r>
-    </w:p>
-    <w:p>
-      <w:pPr>
-        <w:pStyle w:val="BodyText"/>
-        <w:spacing w:lineRule="auto" w:line="360"/>
-        <w:jc w:val="both"/>
-        <w:rPr>
-          <w:rFonts w:ascii="Liberation Serif" w:hAnsi="Liberation Serif"/>
-          <w:color w:val="FFFFFF"/>
-          <w:sz w:val="28"/>
-          <w:szCs w:val="28"/>
-        </w:rPr>
-      </w:pPr>
-      <w:r>
-        <w:rPr>
-          <w:rFonts w:ascii="Liberation Serif" w:hAnsi="Liberation Serif"/>
-          <w:color w:val="FFFFFF"/>
+          <w:sz w:val="28"/>
+          <w:szCs w:val="28"/>
+        </w:rPr>
+      </w:r>
+    </w:p>
+    <w:p>
+      <w:pPr>
+        <w:pStyle w:val="Normal"/>
+        <w:spacing w:lineRule="auto" w:line="360" w:before="0" w:after="0"/>
+        <w:jc w:val="center"/>
+        <w:rPr>
+          <w:rFonts w:ascii="Liberation Serif" w:hAnsi="Liberation Serif"/>
+          <w:sz w:val="28"/>
+          <w:szCs w:val="28"/>
+        </w:rPr>
+      </w:pPr>
+      <w:r>
+        <w:rPr>
+          <w:rFonts w:ascii="Liberation Serif" w:hAnsi="Liberation Serif"/>
           <w:sz w:val="28"/>
           <w:szCs w:val="28"/>
         </w:rPr>
@@ -9768,19 +9660,13 @@
         <w:jc w:val="both"/>
         <w:rPr>
           <w:rFonts w:ascii="Liberation Serif" w:hAnsi="Liberation Serif"/>
-          <w:b w:val="false"/>
-          <w:bCs w:val="false"/>
-          <w:color w:val="FFFFFF"/>
-          <w:sz w:val="28"/>
-          <w:szCs w:val="28"/>
-        </w:rPr>
-      </w:pPr>
-      <w:r>
-        <w:rPr>
-          <w:rFonts w:ascii="Liberation Serif" w:hAnsi="Liberation Serif"/>
-          <w:b w:val="false"/>
-          <w:bCs w:val="false"/>
-          <w:color w:val="FFFFFF"/>
+          <w:sz w:val="28"/>
+          <w:szCs w:val="28"/>
+        </w:rPr>
+      </w:pPr>
+      <w:r>
+        <w:rPr>
+          <w:rFonts w:ascii="Liberation Serif" w:hAnsi="Liberation Serif"/>
           <w:sz w:val="28"/>
           <w:szCs w:val="28"/>
         </w:rPr>
@@ -9793,68 +9679,22 @@
         <w:jc w:val="center"/>
         <w:rPr>
           <w:rFonts w:ascii="Liberation Serif" w:hAnsi="Liberation Serif"/>
-          <w:b/>
-          <w:bCs/>
-          <w:color w:val="FFFFFF"/>
-          <w:sz w:val="28"/>
-          <w:szCs w:val="28"/>
-        </w:rPr>
-      </w:pPr>
-      <w:r>
-        <w:rPr>
-          <w:rFonts w:ascii="Liberation Serif" w:hAnsi="Liberation Serif"/>
-          <w:b/>
-          <w:bCs/>
-          <w:color w:val="FFFFFF"/>
-          <w:sz w:val="28"/>
-          <w:szCs w:val="28"/>
-        </w:rPr>
-        <w:drawing>
-          <wp:anchor behindDoc="0" distT="0" distB="0" distL="0" distR="0" simplePos="0" locked="0" layoutInCell="0" allowOverlap="1" relativeHeight="8">
-            <wp:simplePos x="0" y="0"/>
-            <wp:positionH relativeFrom="column">
-              <wp:posOffset>659130</wp:posOffset>
-            </wp:positionH>
-            <wp:positionV relativeFrom="paragraph">
-              <wp:posOffset>163195</wp:posOffset>
-            </wp:positionV>
-            <wp:extent cx="4651375" cy="2438400"/>
-            <wp:effectExtent l="0" t="0" r="0" b="0"/>
-            <wp:wrapSquare wrapText="largest"/>
-            <wp:docPr id="6" name="Изображение6" descr=""/>
-            <wp:cNvGraphicFramePr>
-              <a:graphicFrameLocks xmlns:a="http://schemas.openxmlformats.org/drawingml/2006/main" noChangeAspect="1"/>
-            </wp:cNvGraphicFramePr>
-            <a:graphic xmlns:a="http://schemas.openxmlformats.org/drawingml/2006/main">
-              <a:graphicData uri="http://schemas.openxmlformats.org/drawingml/2006/picture">
-                <pic:pic xmlns:pic="http://schemas.openxmlformats.org/drawingml/2006/picture">
-                  <pic:nvPicPr>
-                    <pic:cNvPr id="6" name="Изображение6" descr=""/>
-                    <pic:cNvPicPr>
-                      <a:picLocks noChangeAspect="1" noChangeArrowheads="1"/>
-                    </pic:cNvPicPr>
-                  </pic:nvPicPr>
-                  <pic:blipFill>
-                    <a:blip r:embed="rId7"/>
-                    <a:stretch>
-                      <a:fillRect/>
-                    </a:stretch>
-                  </pic:blipFill>
-                  <pic:spPr bwMode="auto">
-                    <a:xfrm>
-                      <a:off x="0" y="0"/>
-                      <a:ext cx="4651375" cy="2438400"/>
-                    </a:xfrm>
-                    <a:prstGeom prst="rect">
-                      <a:avLst/>
-                    </a:prstGeom>
-                    <a:noFill/>
-                  </pic:spPr>
-                </pic:pic>
-              </a:graphicData>
-            </a:graphic>
-          </wp:anchor>
-        </w:drawing>
+          <w:b w:val="false"/>
+          <w:bCs w:val="false"/>
+          <w:color w:val="FFFFFF"/>
+          <w:sz w:val="28"/>
+          <w:szCs w:val="28"/>
+        </w:rPr>
+      </w:pPr>
+      <w:r>
+        <w:rPr>
+          <w:rFonts w:ascii="Liberation Serif" w:hAnsi="Liberation Serif"/>
+          <w:b w:val="false"/>
+          <w:bCs w:val="false"/>
+          <w:color w:themeColor="accent1" w:themeShade="bf" w:val="FFFFFF"/>
+          <w:sz w:val="28"/>
+          <w:szCs w:val="28"/>
+        </w:rPr>
       </w:r>
     </w:p>
     <w:p>
@@ -9876,7 +9716,7 @@
           <w:rFonts w:ascii="Liberation Serif" w:hAnsi="Liberation Serif"/>
           <w:b/>
           <w:bCs/>
-          <w:color w:val="FFFFFF"/>
+          <w:color w:themeColor="accent1" w:themeShade="bf" w:val="FFFFFF"/>
           <w:sz w:val="28"/>
           <w:szCs w:val="28"/>
         </w:rPr>
@@ -9901,7 +9741,7 @@
           <w:rFonts w:ascii="Liberation Serif" w:hAnsi="Liberation Serif"/>
           <w:b/>
           <w:bCs/>
-          <w:color w:val="FFFFFF"/>
+          <w:color w:themeColor="accent1" w:themeShade="bf" w:val="FFFFFF"/>
           <w:sz w:val="28"/>
           <w:szCs w:val="28"/>
         </w:rPr>
@@ -9926,7 +9766,7 @@
           <w:rFonts w:ascii="Liberation Serif" w:hAnsi="Liberation Serif"/>
           <w:b/>
           <w:bCs/>
-          <w:color w:val="FFFFFF"/>
+          <w:color w:themeColor="accent1" w:themeShade="bf" w:val="FFFFFF"/>
           <w:sz w:val="28"/>
           <w:szCs w:val="28"/>
         </w:rPr>
@@ -9951,7 +9791,7 @@
           <w:rFonts w:ascii="Liberation Serif" w:hAnsi="Liberation Serif"/>
           <w:b/>
           <w:bCs/>
-          <w:color w:val="FFFFFF"/>
+          <w:color w:themeColor="accent1" w:themeShade="bf" w:val="FFFFFF"/>
           <w:sz w:val="28"/>
           <w:szCs w:val="28"/>
         </w:rPr>
@@ -9976,7 +9816,7 @@
           <w:rFonts w:ascii="Liberation Serif" w:hAnsi="Liberation Serif"/>
           <w:b/>
           <w:bCs/>
-          <w:color w:val="FFFFFF"/>
+          <w:color w:themeColor="accent1" w:themeShade="bf" w:val="FFFFFF"/>
           <w:sz w:val="28"/>
           <w:szCs w:val="28"/>
         </w:rPr>
@@ -10001,7 +9841,7 @@
           <w:rFonts w:ascii="Liberation Serif" w:hAnsi="Liberation Serif"/>
           <w:b/>
           <w:bCs/>
-          <w:color w:val="FFFFFF"/>
+          <w:color w:themeColor="accent1" w:themeShade="bf" w:val="FFFFFF"/>
           <w:sz w:val="28"/>
           <w:szCs w:val="28"/>
         </w:rPr>
@@ -10026,7 +9866,7 @@
           <w:rFonts w:ascii="Liberation Serif" w:hAnsi="Liberation Serif"/>
           <w:b/>
           <w:bCs/>
-          <w:color w:val="FFFFFF"/>
+          <w:color w:themeColor="accent1" w:themeShade="bf" w:val="FFFFFF"/>
           <w:sz w:val="28"/>
           <w:szCs w:val="28"/>
         </w:rPr>
@@ -10051,7 +9891,7 @@
           <w:rFonts w:ascii="Liberation Serif" w:hAnsi="Liberation Serif"/>
           <w:b/>
           <w:bCs/>
-          <w:color w:val="FFFFFF"/>
+          <w:color w:themeColor="accent1" w:themeShade="bf" w:val="FFFFFF"/>
           <w:sz w:val="28"/>
           <w:szCs w:val="28"/>
         </w:rPr>
@@ -10076,7 +9916,7 @@
           <w:rFonts w:ascii="Liberation Serif" w:hAnsi="Liberation Serif"/>
           <w:b/>
           <w:bCs/>
-          <w:color w:val="FFFFFF"/>
+          <w:color w:themeColor="accent1" w:themeShade="bf" w:val="FFFFFF"/>
           <w:sz w:val="28"/>
           <w:szCs w:val="28"/>
         </w:rPr>
@@ -10101,7 +9941,7 @@
           <w:rFonts w:ascii="Liberation Serif" w:hAnsi="Liberation Serif"/>
           <w:b/>
           <w:bCs/>
-          <w:color w:val="FFFFFF"/>
+          <w:color w:themeColor="accent1" w:themeShade="bf" w:val="FFFFFF"/>
           <w:sz w:val="28"/>
           <w:szCs w:val="28"/>
         </w:rPr>
@@ -10126,7 +9966,7 @@
           <w:rFonts w:ascii="Liberation Serif" w:hAnsi="Liberation Serif"/>
           <w:b/>
           <w:bCs/>
-          <w:color w:val="FFFFFF"/>
+          <w:color w:themeColor="accent1" w:themeShade="bf" w:val="FFFFFF"/>
           <w:sz w:val="28"/>
           <w:szCs w:val="28"/>
         </w:rPr>
@@ -10139,544 +9979,22 @@
         <w:jc w:val="center"/>
         <w:rPr>
           <w:rFonts w:ascii="Liberation Serif" w:hAnsi="Liberation Serif"/>
-          <w:b w:val="false"/>
-          <w:bCs w:val="false"/>
-          <w:color w:val="FFFFFF"/>
-          <w:sz w:val="28"/>
-          <w:szCs w:val="28"/>
-        </w:rPr>
-      </w:pPr>
-      <w:r>
-        <w:rPr>
-          <w:rFonts w:ascii="Liberation Serif" w:hAnsi="Liberation Serif"/>
-          <w:b w:val="false"/>
-          <w:bCs w:val="false"/>
-          <w:color w:val="FFFFFF"/>
-          <w:sz w:val="28"/>
-          <w:szCs w:val="28"/>
-        </w:rPr>
-        <w:t>Рисунок 6 — Многослойная архитектура бекенд-приложения</w:t>
-      </w:r>
-    </w:p>
-    <w:p>
-      <w:pPr>
-        <w:pStyle w:val="Normal"/>
-        <w:spacing w:lineRule="auto" w:line="360" w:before="0" w:after="0"/>
-        <w:jc w:val="center"/>
-        <w:rPr>
-          <w:rFonts w:ascii="Liberation Serif" w:hAnsi="Liberation Serif"/>
-          <w:b w:val="false"/>
-          <w:bCs w:val="false"/>
-          <w:color w:val="FFFFFF"/>
-          <w:sz w:val="28"/>
-          <w:szCs w:val="28"/>
-        </w:rPr>
-      </w:pPr>
-      <w:r>
-        <w:rPr>
-          <w:rFonts w:ascii="Liberation Serif" w:hAnsi="Liberation Serif"/>
-          <w:b w:val="false"/>
-          <w:bCs w:val="false"/>
-          <w:color w:val="FFFFFF"/>
-          <w:sz w:val="28"/>
-          <w:szCs w:val="28"/>
-        </w:rPr>
-      </w:r>
-    </w:p>
-    <w:p>
-      <w:pPr>
-        <w:pStyle w:val="Normal"/>
-        <w:spacing w:lineRule="auto" w:line="360" w:before="0" w:after="0"/>
-        <w:jc w:val="both"/>
-        <w:rPr>
-          <w:rFonts w:ascii="Liberation Serif" w:hAnsi="Liberation Serif"/>
-          <w:b w:val="false"/>
-          <w:bCs w:val="false"/>
-          <w:color w:val="FFFFFF"/>
-          <w:sz w:val="28"/>
-          <w:szCs w:val="28"/>
-        </w:rPr>
-      </w:pPr>
-      <w:r>
-        <w:rPr>
-          <w:rStyle w:val="Strong"/>
-          <w:rFonts w:ascii="Liberation Serif" w:hAnsi="Liberation Serif"/>
-          <w:b w:val="false"/>
-          <w:bCs w:val="false"/>
-          <w:color w:val="FFFFFF"/>
-          <w:sz w:val="28"/>
-          <w:szCs w:val="28"/>
-        </w:rPr>
-        <w:tab/>
-        <w:t>Слой представления (Presentation Layer).</w:t>
-      </w:r>
-      <w:r>
-        <w:rPr>
-          <w:rFonts w:ascii="Liberation Serif" w:hAnsi="Liberation Serif"/>
-          <w:b w:val="false"/>
-          <w:bCs w:val="false"/>
-          <w:color w:val="FFFFFF"/>
-          <w:sz w:val="28"/>
-          <w:szCs w:val="28"/>
-        </w:rPr>
-        <w:t xml:space="preserve"> Пакет </w:t>
-      </w:r>
-      <w:r>
-        <w:rPr>
-          <w:rStyle w:val="Style17"/>
-          <w:rFonts w:ascii="Liberation Serif" w:hAnsi="Liberation Serif"/>
-          <w:b w:val="false"/>
-          <w:bCs w:val="false"/>
-          <w:color w:val="FFFFFF"/>
-          <w:sz w:val="28"/>
-          <w:szCs w:val="28"/>
-        </w:rPr>
-        <w:t>controller</w:t>
-      </w:r>
-      <w:r>
-        <w:rPr>
-          <w:rFonts w:ascii="Liberation Serif" w:hAnsi="Liberation Serif"/>
-          <w:b w:val="false"/>
-          <w:bCs w:val="false"/>
-          <w:color w:val="FFFFFF"/>
-          <w:sz w:val="28"/>
-          <w:szCs w:val="28"/>
-        </w:rPr>
-        <w:t xml:space="preserve"> содержит REST-контроллеры, принимающие HTTP-запросы и возвращающие HTTP-ответы. Контроллеры не содержат бизнес-логики — они лишь валидируют входные данные, делегируют обработку сервисному слою и формируют ответ. </w:t>
-      </w:r>
-    </w:p>
-    <w:p>
-      <w:pPr>
-        <w:pStyle w:val="Normal"/>
-        <w:spacing w:lineRule="auto" w:line="360" w:before="0" w:after="0"/>
-        <w:jc w:val="both"/>
-        <w:rPr/>
-      </w:pPr>
-      <w:r>
-        <w:rPr>
-          <w:rFonts w:ascii="Liberation Serif" w:hAnsi="Liberation Serif"/>
-          <w:b w:val="false"/>
-          <w:bCs w:val="false"/>
-          <w:color w:val="FFFFFF"/>
-          <w:sz w:val="28"/>
-          <w:szCs w:val="28"/>
-        </w:rPr>
-        <w:tab/>
-      </w:r>
-      <w:r>
-        <w:rPr>
-          <w:rStyle w:val="Strong"/>
-          <w:rFonts w:ascii="Liberation Serif" w:hAnsi="Liberation Serif"/>
-          <w:b w:val="false"/>
-          <w:bCs w:val="false"/>
-          <w:sz w:val="28"/>
-          <w:szCs w:val="28"/>
-        </w:rPr>
-        <w:t>Слой объектов передачи данных (DTO Layer).</w:t>
-      </w:r>
-      <w:r>
-        <w:rPr>
-          <w:rFonts w:ascii="Liberation Serif" w:hAnsi="Liberation Serif"/>
-          <w:b w:val="false"/>
-          <w:bCs w:val="false"/>
-          <w:sz w:val="28"/>
-          <w:szCs w:val="28"/>
-        </w:rPr>
-        <w:t xml:space="preserve"> Пакеты </w:t>
-      </w:r>
-      <w:r>
-        <w:rPr>
-          <w:rStyle w:val="Style17"/>
-          <w:rFonts w:ascii="Liberation Serif" w:hAnsi="Liberation Serif"/>
-          <w:b w:val="false"/>
-          <w:bCs w:val="false"/>
-          <w:sz w:val="28"/>
-          <w:szCs w:val="28"/>
-        </w:rPr>
-        <w:t>dto.request</w:t>
-      </w:r>
-      <w:r>
-        <w:rPr>
-          <w:rFonts w:ascii="Liberation Serif" w:hAnsi="Liberation Serif"/>
-          <w:b w:val="false"/>
-          <w:bCs w:val="false"/>
-          <w:sz w:val="28"/>
-          <w:szCs w:val="28"/>
-        </w:rPr>
-        <w:t xml:space="preserve"> и </w:t>
-      </w:r>
-      <w:r>
-        <w:rPr>
-          <w:rStyle w:val="Style17"/>
-          <w:rFonts w:ascii="Liberation Serif" w:hAnsi="Liberation Serif"/>
-          <w:b w:val="false"/>
-          <w:bCs w:val="false"/>
-          <w:sz w:val="28"/>
-          <w:szCs w:val="28"/>
-        </w:rPr>
-        <w:t>dto.response</w:t>
-      </w:r>
-      <w:r>
-        <w:rPr>
-          <w:rFonts w:ascii="Liberation Serif" w:hAnsi="Liberation Serif"/>
-          <w:b w:val="false"/>
-          <w:bCs w:val="false"/>
-          <w:sz w:val="28"/>
-          <w:szCs w:val="28"/>
-        </w:rPr>
-        <w:t xml:space="preserve"> содержат объекты, используемые для типизации входных и выходных данных API. Разделение на два подпакета обеспечивает явное различие между данными, поступающими от клиента, и данными, возвращаемыми ему. Использование DTO изолирует внутреннюю доменную модель от внешнего API-контракта, что позволяет изменять структуру сущностей базы данных без нарушения совместимости с клиентским приложением.</w:t>
-      </w:r>
-    </w:p>
-    <w:p>
-      <w:pPr>
-        <w:pStyle w:val="Normal"/>
-        <w:spacing w:lineRule="auto" w:line="360" w:before="0" w:after="0"/>
-        <w:jc w:val="both"/>
-        <w:rPr/>
-      </w:pPr>
-      <w:r>
-        <w:rPr>
-          <w:rFonts w:ascii="Liberation Serif" w:hAnsi="Liberation Serif"/>
-          <w:b w:val="false"/>
-          <w:bCs w:val="false"/>
-          <w:sz w:val="28"/>
-          <w:szCs w:val="28"/>
-        </w:rPr>
-        <w:tab/>
-      </w:r>
-      <w:r>
-        <w:rPr>
-          <w:rStyle w:val="Strong"/>
-          <w:rFonts w:ascii="Liberation Serif" w:hAnsi="Liberation Serif"/>
-          <w:b w:val="false"/>
-          <w:bCs w:val="false"/>
-          <w:sz w:val="28"/>
-          <w:szCs w:val="28"/>
-        </w:rPr>
-        <w:t>Слой бизнес-логики (Service Layer).</w:t>
-      </w:r>
-      <w:r>
-        <w:rPr>
-          <w:rFonts w:ascii="Liberation Serif" w:hAnsi="Liberation Serif"/>
-          <w:b w:val="false"/>
-          <w:bCs w:val="false"/>
-          <w:sz w:val="28"/>
-          <w:szCs w:val="28"/>
-        </w:rPr>
-        <w:t xml:space="preserve"> Пакет </w:t>
-      </w:r>
-      <w:r>
-        <w:rPr>
-          <w:rStyle w:val="Style17"/>
-          <w:rFonts w:ascii="Liberation Serif" w:hAnsi="Liberation Serif"/>
-          <w:b w:val="false"/>
-          <w:bCs w:val="false"/>
-          <w:sz w:val="28"/>
-          <w:szCs w:val="28"/>
-        </w:rPr>
-        <w:t>service</w:t>
-      </w:r>
-      <w:r>
-        <w:rPr>
-          <w:rFonts w:ascii="Liberation Serif" w:hAnsi="Liberation Serif"/>
-          <w:b w:val="false"/>
-          <w:bCs w:val="false"/>
-          <w:sz w:val="28"/>
-          <w:szCs w:val="28"/>
-        </w:rPr>
-        <w:t xml:space="preserve"> содержит сервисы, реализующие основную бизнес-логику приложения. Каждый сервис инкапсулирует логику работы с определённой доменной областью и является единственным местом, где принимаются бизнес-решения.</w:t>
-      </w:r>
-    </w:p>
-    <w:p>
-      <w:pPr>
-        <w:pStyle w:val="Normal"/>
-        <w:spacing w:lineRule="auto" w:line="360" w:before="0" w:after="0"/>
-        <w:jc w:val="both"/>
-        <w:rPr/>
-      </w:pPr>
-      <w:r>
-        <w:rPr>
-          <w:rStyle w:val="Strong"/>
-          <w:rFonts w:ascii="Liberation Serif" w:hAnsi="Liberation Serif"/>
-          <w:b w:val="false"/>
-          <w:bCs w:val="false"/>
-          <w:sz w:val="28"/>
-          <w:szCs w:val="28"/>
-        </w:rPr>
-        <w:tab/>
-        <w:t>Слой доступа к данным (Repository Layer).</w:t>
-      </w:r>
-      <w:r>
-        <w:rPr>
-          <w:rFonts w:ascii="Liberation Serif" w:hAnsi="Liberation Serif"/>
-          <w:b w:val="false"/>
-          <w:bCs w:val="false"/>
-          <w:sz w:val="28"/>
-          <w:szCs w:val="28"/>
-        </w:rPr>
-        <w:t xml:space="preserve"> Пакет </w:t>
-      </w:r>
-      <w:r>
-        <w:rPr>
-          <w:rStyle w:val="Style17"/>
-          <w:rFonts w:ascii="Liberation Serif" w:hAnsi="Liberation Serif"/>
-          <w:b w:val="false"/>
-          <w:bCs w:val="false"/>
-          <w:sz w:val="28"/>
-          <w:szCs w:val="28"/>
-        </w:rPr>
-        <w:t>repository</w:t>
-      </w:r>
-      <w:r>
-        <w:rPr>
-          <w:rFonts w:ascii="Liberation Serif" w:hAnsi="Liberation Serif"/>
-          <w:b w:val="false"/>
-          <w:bCs w:val="false"/>
-          <w:sz w:val="28"/>
-          <w:szCs w:val="28"/>
-        </w:rPr>
-        <w:t xml:space="preserve"> содержит интерфейсы, расширяющие </w:t>
-      </w:r>
-      <w:r>
-        <w:rPr>
-          <w:rStyle w:val="Style17"/>
-          <w:rFonts w:ascii="Liberation Serif" w:hAnsi="Liberation Serif"/>
-          <w:b w:val="false"/>
-          <w:bCs w:val="false"/>
-          <w:sz w:val="28"/>
-          <w:szCs w:val="28"/>
-        </w:rPr>
-        <w:t>JpaRepository</w:t>
-      </w:r>
-      <w:r>
-        <w:rPr>
-          <w:rFonts w:ascii="Liberation Serif" w:hAnsi="Liberation Serif"/>
-          <w:b w:val="false"/>
-          <w:bCs w:val="false"/>
-          <w:sz w:val="28"/>
-          <w:szCs w:val="28"/>
-        </w:rPr>
-        <w:t xml:space="preserve"> из Spring Data JPA. Репозитории абстрагируют операции с базой данных, предоставляя декларативные методы для стандартных CRUD-операций и пользовательских запросов.</w:t>
-      </w:r>
-    </w:p>
-    <w:p>
-      <w:pPr>
-        <w:pStyle w:val="Normal"/>
-        <w:spacing w:lineRule="auto" w:line="360" w:before="0" w:after="0"/>
-        <w:jc w:val="both"/>
-        <w:rPr/>
-      </w:pPr>
-      <w:r>
-        <w:rPr>
-          <w:rStyle w:val="Strong"/>
-          <w:rFonts w:ascii="Liberation Serif" w:hAnsi="Liberation Serif"/>
-          <w:b w:val="false"/>
-          <w:bCs w:val="false"/>
-          <w:sz w:val="28"/>
-          <w:szCs w:val="28"/>
-        </w:rPr>
-        <w:tab/>
-        <w:t>Слой доменной модели (Entity Layer).</w:t>
-      </w:r>
-      <w:r>
-        <w:rPr>
-          <w:rFonts w:ascii="Liberation Serif" w:hAnsi="Liberation Serif"/>
-          <w:b w:val="false"/>
-          <w:bCs w:val="false"/>
-          <w:sz w:val="28"/>
-          <w:szCs w:val="28"/>
-        </w:rPr>
-        <w:t xml:space="preserve"> Пакет </w:t>
-      </w:r>
-      <w:r>
-        <w:rPr>
-          <w:rStyle w:val="Style17"/>
-          <w:rFonts w:ascii="Liberation Serif" w:hAnsi="Liberation Serif"/>
-          <w:b w:val="false"/>
-          <w:bCs w:val="false"/>
-          <w:sz w:val="28"/>
-          <w:szCs w:val="28"/>
-        </w:rPr>
-        <w:t>entity</w:t>
-      </w:r>
-      <w:r>
-        <w:rPr>
-          <w:rFonts w:ascii="Liberation Serif" w:hAnsi="Liberation Serif"/>
-          <w:b w:val="false"/>
-          <w:bCs w:val="false"/>
-          <w:sz w:val="28"/>
-          <w:szCs w:val="28"/>
-        </w:rPr>
-        <w:t xml:space="preserve"> содержит JPA-сущности, представляющие таблицы базы данных. Каждая сущность аннотирована </w:t>
-      </w:r>
-      <w:r>
-        <w:rPr>
-          <w:rStyle w:val="Style17"/>
-          <w:rFonts w:ascii="Liberation Serif" w:hAnsi="Liberation Serif"/>
-          <w:b w:val="false"/>
-          <w:bCs w:val="false"/>
-          <w:sz w:val="28"/>
-          <w:szCs w:val="28"/>
-        </w:rPr>
-        <w:t>@Entity</w:t>
-      </w:r>
-      <w:r>
-        <w:rPr>
-          <w:rFonts w:ascii="Liberation Serif" w:hAnsi="Liberation Serif"/>
-          <w:b w:val="false"/>
-          <w:bCs w:val="false"/>
-          <w:sz w:val="28"/>
-          <w:szCs w:val="28"/>
-        </w:rPr>
-        <w:t xml:space="preserve"> и </w:t>
-      </w:r>
-      <w:r>
-        <w:rPr>
-          <w:rStyle w:val="Style17"/>
-          <w:rFonts w:ascii="Liberation Serif" w:hAnsi="Liberation Serif"/>
-          <w:b w:val="false"/>
-          <w:bCs w:val="false"/>
-          <w:sz w:val="28"/>
-          <w:szCs w:val="28"/>
-        </w:rPr>
-        <w:t>@Table</w:t>
-      </w:r>
-      <w:r>
-        <w:rPr>
-          <w:rFonts w:ascii="Liberation Serif" w:hAnsi="Liberation Serif"/>
-          <w:b w:val="false"/>
-          <w:bCs w:val="false"/>
-          <w:sz w:val="28"/>
-          <w:szCs w:val="28"/>
-        </w:rPr>
-        <w:t>, а поля — аннотациями JPA для определения типов столбцов, ограничений и связей.</w:t>
-      </w:r>
-    </w:p>
-    <w:p>
-      <w:pPr>
-        <w:pStyle w:val="Normal"/>
-        <w:spacing w:lineRule="auto" w:line="360" w:before="0" w:after="0"/>
-        <w:jc w:val="both"/>
-        <w:rPr/>
-      </w:pPr>
-      <w:r>
-        <w:rPr>
-          <w:rStyle w:val="Strong"/>
-          <w:rFonts w:ascii="Liberation Serif" w:hAnsi="Liberation Serif"/>
-          <w:b w:val="false"/>
-          <w:bCs w:val="false"/>
-          <w:sz w:val="28"/>
-          <w:szCs w:val="28"/>
-        </w:rPr>
-        <w:tab/>
-        <w:t>Слой конфигурации (Configuration Layer).</w:t>
-      </w:r>
-      <w:r>
-        <w:rPr>
-          <w:rFonts w:ascii="Liberation Serif" w:hAnsi="Liberation Serif"/>
-          <w:b w:val="false"/>
-          <w:bCs w:val="false"/>
-          <w:sz w:val="28"/>
-          <w:szCs w:val="28"/>
-        </w:rPr>
-        <w:t xml:space="preserve"> Пакет </w:t>
-      </w:r>
-      <w:r>
-        <w:rPr>
-          <w:rStyle w:val="Style17"/>
-          <w:rFonts w:ascii="Liberation Serif" w:hAnsi="Liberation Serif"/>
-          <w:b w:val="false"/>
-          <w:bCs w:val="false"/>
-          <w:sz w:val="28"/>
-          <w:szCs w:val="28"/>
-        </w:rPr>
-        <w:t>config</w:t>
-      </w:r>
-      <w:r>
-        <w:rPr>
-          <w:rFonts w:ascii="Liberation Serif" w:hAnsi="Liberation Serif"/>
-          <w:b w:val="false"/>
-          <w:bCs w:val="false"/>
-          <w:sz w:val="28"/>
-          <w:szCs w:val="28"/>
-        </w:rPr>
-        <w:t xml:space="preserve"> содержит конфигурационные классы Spring, определяющие поведение приложения.</w:t>
-      </w:r>
-    </w:p>
-    <w:p>
-      <w:pPr>
-        <w:pStyle w:val="BodyText"/>
-        <w:spacing w:lineRule="auto" w:line="360" w:before="0" w:after="0"/>
-        <w:jc w:val="both"/>
-        <w:rPr/>
-      </w:pPr>
-      <w:r>
-        <w:rPr>
-          <w:rStyle w:val="Strong"/>
-          <w:rFonts w:ascii="Liberation Serif" w:hAnsi="Liberation Serif"/>
-          <w:b w:val="false"/>
-          <w:bCs w:val="false"/>
-          <w:sz w:val="28"/>
-          <w:szCs w:val="28"/>
-        </w:rPr>
-        <w:tab/>
-        <w:t>Слой обработки исключений (Exception Layer).</w:t>
-      </w:r>
-      <w:r>
-        <w:rPr>
-          <w:rFonts w:ascii="Liberation Serif" w:hAnsi="Liberation Serif"/>
-          <w:b w:val="false"/>
-          <w:bCs w:val="false"/>
-          <w:sz w:val="28"/>
-          <w:szCs w:val="28"/>
-        </w:rPr>
-        <w:t xml:space="preserve"> Пакет </w:t>
-      </w:r>
-      <w:r>
-        <w:rPr>
-          <w:rStyle w:val="Style17"/>
-          <w:rFonts w:ascii="Liberation Serif" w:hAnsi="Liberation Serif"/>
-          <w:b w:val="false"/>
-          <w:bCs w:val="false"/>
-          <w:sz w:val="28"/>
-          <w:szCs w:val="28"/>
-        </w:rPr>
-        <w:t>exception</w:t>
-      </w:r>
-      <w:r>
-        <w:rPr>
-          <w:rFonts w:ascii="Liberation Serif" w:hAnsi="Liberation Serif"/>
-          <w:b w:val="false"/>
-          <w:bCs w:val="false"/>
-          <w:sz w:val="28"/>
-          <w:szCs w:val="28"/>
-        </w:rPr>
-        <w:t xml:space="preserve"> обеспечивает централизованную и единообразную обработку ошибок во всём приложении.</w:t>
-      </w:r>
-    </w:p>
-    <w:p>
-      <w:pPr>
-        <w:pStyle w:val="Normal"/>
-        <w:spacing w:lineRule="auto" w:line="360" w:before="0" w:after="0"/>
-        <w:jc w:val="both"/>
-        <w:rPr>
-          <w:rFonts w:ascii="Liberation Serif" w:hAnsi="Liberation Serif"/>
-          <w:b w:val="false"/>
-          <w:bCs w:val="false"/>
-          <w:sz w:val="28"/>
-          <w:szCs w:val="28"/>
-        </w:rPr>
-      </w:pPr>
-      <w:r>
-        <w:rPr>
-          <w:rFonts w:ascii="Liberation Serif" w:hAnsi="Liberation Serif"/>
-          <w:b w:val="false"/>
-          <w:bCs w:val="false"/>
-          <w:sz w:val="28"/>
-          <w:szCs w:val="28"/>
-        </w:rPr>
-        <w:tab/>
-        <w:t>Создание проекта является центральным сценарием использования платформы и инициирует цепочку автоматизированных действий, охватывающих как внутренние операции бэкенда, так и взаимодействие с GitLab API.</w:t>
+          <w:b/>
+          <w:bCs/>
+          <w:color w:val="FFFFFF"/>
+          <w:sz w:val="28"/>
+          <w:szCs w:val="28"/>
+        </w:rPr>
+      </w:pPr>
+      <w:r>
+        <w:rPr>
+          <w:rFonts w:ascii="Liberation Serif" w:hAnsi="Liberation Serif"/>
+          <w:b/>
+          <w:bCs/>
+          <w:color w:themeColor="accent1" w:themeShade="bf" w:val="FFFFFF"/>
+          <w:sz w:val="28"/>
+          <w:szCs w:val="28"/>
+        </w:rPr>
       </w:r>
     </w:p>
     <w:p>
@@ -10686,115 +10004,19 @@
         <w:jc w:val="center"/>
         <w:rPr>
           <w:rFonts w:ascii="Liberation Serif" w:hAnsi="Liberation Serif"/>
-          <w:b w:val="false"/>
-          <w:bCs w:val="false"/>
-          <w:color w:val="FFFFFF"/>
-          <w:sz w:val="28"/>
-          <w:szCs w:val="28"/>
-        </w:rPr>
-      </w:pPr>
-      <w:r>
-        <w:rPr>
-          <w:rFonts w:ascii="Liberation Serif" w:hAnsi="Liberation Serif"/>
-          <w:b w:val="false"/>
-          <w:bCs w:val="false"/>
-          <w:color w:val="FFFFFF"/>
-          <w:sz w:val="28"/>
-          <w:szCs w:val="28"/>
-        </w:rPr>
-        <w:drawing>
-          <wp:anchor behindDoc="0" distT="0" distB="0" distL="0" distR="0" simplePos="0" locked="0" layoutInCell="0" allowOverlap="1" relativeHeight="9">
-            <wp:simplePos x="0" y="0"/>
-            <wp:positionH relativeFrom="column">
-              <wp:posOffset>780415</wp:posOffset>
-            </wp:positionH>
-            <wp:positionV relativeFrom="paragraph">
-              <wp:posOffset>-13970</wp:posOffset>
-            </wp:positionV>
-            <wp:extent cx="4504055" cy="3425190"/>
-            <wp:effectExtent l="0" t="0" r="0" b="0"/>
-            <wp:wrapSquare wrapText="largest"/>
-            <wp:docPr id="7" name="Изображение7" descr=""/>
-            <wp:cNvGraphicFramePr>
-              <a:graphicFrameLocks xmlns:a="http://schemas.openxmlformats.org/drawingml/2006/main" noChangeAspect="1"/>
-            </wp:cNvGraphicFramePr>
-            <a:graphic xmlns:a="http://schemas.openxmlformats.org/drawingml/2006/main">
-              <a:graphicData uri="http://schemas.openxmlformats.org/drawingml/2006/picture">
-                <pic:pic xmlns:pic="http://schemas.openxmlformats.org/drawingml/2006/picture">
-                  <pic:nvPicPr>
-                    <pic:cNvPr id="7" name="Изображение7" descr=""/>
-                    <pic:cNvPicPr>
-                      <a:picLocks noChangeAspect="1" noChangeArrowheads="1"/>
-                    </pic:cNvPicPr>
-                  </pic:nvPicPr>
-                  <pic:blipFill>
-                    <a:blip r:embed="rId8"/>
-                    <a:stretch>
-                      <a:fillRect/>
-                    </a:stretch>
-                  </pic:blipFill>
-                  <pic:spPr bwMode="auto">
-                    <a:xfrm>
-                      <a:off x="0" y="0"/>
-                      <a:ext cx="4504055" cy="3425190"/>
-                    </a:xfrm>
-                    <a:prstGeom prst="rect">
-                      <a:avLst/>
-                    </a:prstGeom>
-                    <a:noFill/>
-                  </pic:spPr>
-                </pic:pic>
-              </a:graphicData>
-            </a:graphic>
-          </wp:anchor>
-        </w:drawing>
-      </w:r>
-    </w:p>
-    <w:p>
-      <w:pPr>
-        <w:pStyle w:val="Normal"/>
-        <w:spacing w:before="0" w:after="0"/>
-        <w:jc w:val="center"/>
-        <w:rPr>
-          <w:rFonts w:ascii="Liberation Serif" w:hAnsi="Liberation Serif"/>
-          <w:b w:val="false"/>
-          <w:bCs w:val="false"/>
-          <w:color w:val="FFFFFF"/>
-          <w:sz w:val="28"/>
-          <w:szCs w:val="28"/>
-        </w:rPr>
-      </w:pPr>
-      <w:r>
-        <w:rPr>
-          <w:rFonts w:ascii="Liberation Serif" w:hAnsi="Liberation Serif"/>
-          <w:b w:val="false"/>
-          <w:bCs w:val="false"/>
-          <w:color w:val="FFFFFF"/>
-          <w:sz w:val="28"/>
-          <w:szCs w:val="28"/>
-        </w:rPr>
-      </w:r>
-    </w:p>
-    <w:p>
-      <w:pPr>
-        <w:pStyle w:val="Normal"/>
-        <w:spacing w:before="0" w:after="0"/>
-        <w:jc w:val="both"/>
-        <w:rPr>
-          <w:rFonts w:ascii="Liberation Serif" w:hAnsi="Liberation Serif"/>
-          <w:b w:val="false"/>
-          <w:bCs w:val="false"/>
-          <w:color w:val="FFFFFF"/>
-          <w:sz w:val="28"/>
-          <w:szCs w:val="28"/>
-        </w:rPr>
-      </w:pPr>
-      <w:r>
-        <w:rPr>
-          <w:rFonts w:ascii="Liberation Serif" w:hAnsi="Liberation Serif"/>
-          <w:b w:val="false"/>
-          <w:bCs w:val="false"/>
-          <w:color w:val="FFFFFF"/>
+          <w:b/>
+          <w:bCs/>
+          <w:color w:val="FFFFFF"/>
+          <w:sz w:val="28"/>
+          <w:szCs w:val="28"/>
+        </w:rPr>
+      </w:pPr>
+      <w:r>
+        <w:rPr>
+          <w:rFonts w:ascii="Liberation Serif" w:hAnsi="Liberation Serif"/>
+          <w:b/>
+          <w:bCs/>
+          <w:color w:themeColor="accent1" w:themeShade="bf" w:val="FFFFFF"/>
           <w:sz w:val="28"/>
           <w:szCs w:val="28"/>
         </w:rPr>
@@ -10807,218 +10029,19 @@
         <w:jc w:val="center"/>
         <w:rPr>
           <w:rFonts w:ascii="Liberation Serif" w:hAnsi="Liberation Serif"/>
-          <w:b w:val="false"/>
-          <w:bCs w:val="false"/>
-          <w:color w:val="FFFFFF"/>
-          <w:sz w:val="28"/>
-          <w:szCs w:val="28"/>
-        </w:rPr>
-      </w:pPr>
-      <w:r>
-        <w:rPr>
-          <w:rFonts w:ascii="Liberation Serif" w:hAnsi="Liberation Serif"/>
-          <w:b w:val="false"/>
-          <w:bCs w:val="false"/>
-          <w:color w:val="FFFFFF"/>
-          <w:sz w:val="28"/>
-          <w:szCs w:val="28"/>
-        </w:rPr>
-        <w:t xml:space="preserve"> </w:t>
-      </w:r>
-    </w:p>
-    <w:p>
-      <w:pPr>
-        <w:pStyle w:val="Normal"/>
-        <w:spacing w:lineRule="auto" w:line="360" w:before="0" w:after="0"/>
-        <w:jc w:val="both"/>
-        <w:rPr/>
-      </w:pPr>
-      <w:r>
-        <w:rPr/>
-      </w:r>
-    </w:p>
-    <w:p>
-      <w:pPr>
-        <w:pStyle w:val="Normal"/>
-        <w:spacing w:lineRule="auto" w:line="360" w:before="0" w:after="0"/>
-        <w:jc w:val="both"/>
-        <w:rPr/>
-      </w:pPr>
-      <w:r>
-        <w:rPr/>
-      </w:r>
-    </w:p>
-    <w:p>
-      <w:pPr>
-        <w:pStyle w:val="Normal"/>
-        <w:spacing w:lineRule="auto" w:line="360" w:before="0" w:after="0"/>
-        <w:jc w:val="both"/>
-        <w:rPr/>
-      </w:pPr>
-      <w:r>
-        <w:rPr/>
-      </w:r>
-    </w:p>
-    <w:p>
-      <w:pPr>
-        <w:pStyle w:val="Normal"/>
-        <w:spacing w:lineRule="auto" w:line="360" w:before="0" w:after="0"/>
-        <w:jc w:val="both"/>
-        <w:rPr/>
-      </w:pPr>
-      <w:r>
-        <w:rPr/>
-      </w:r>
-    </w:p>
-    <w:p>
-      <w:pPr>
-        <w:pStyle w:val="Normal"/>
-        <w:spacing w:lineRule="auto" w:line="360" w:before="0" w:after="0"/>
-        <w:jc w:val="both"/>
-        <w:rPr/>
-      </w:pPr>
-      <w:r>
-        <w:rPr/>
-      </w:r>
-    </w:p>
-    <w:p>
-      <w:pPr>
-        <w:pStyle w:val="Normal"/>
-        <w:spacing w:lineRule="auto" w:line="360" w:before="0" w:after="0"/>
-        <w:jc w:val="both"/>
-        <w:rPr/>
-      </w:pPr>
-      <w:r>
-        <w:rPr/>
-      </w:r>
-    </w:p>
-    <w:p>
-      <w:pPr>
-        <w:pStyle w:val="Normal"/>
-        <w:spacing w:lineRule="auto" w:line="360" w:before="0" w:after="0"/>
-        <w:jc w:val="both"/>
-        <w:rPr/>
-      </w:pPr>
-      <w:r>
-        <w:rPr/>
-      </w:r>
-    </w:p>
-    <w:p>
-      <w:pPr>
-        <w:pStyle w:val="Normal"/>
-        <w:spacing w:lineRule="auto" w:line="360" w:before="0" w:after="0"/>
-        <w:jc w:val="both"/>
-        <w:rPr/>
-      </w:pPr>
-      <w:r>
-        <w:rPr/>
-      </w:r>
-    </w:p>
-    <w:p>
-      <w:pPr>
-        <w:pStyle w:val="Normal"/>
-        <w:spacing w:lineRule="auto" w:line="360" w:before="0" w:after="0"/>
-        <w:jc w:val="both"/>
-        <w:rPr/>
-      </w:pPr>
-      <w:r>
-        <w:rPr/>
-      </w:r>
-    </w:p>
-    <w:p>
-      <w:pPr>
-        <w:pStyle w:val="Normal"/>
-        <w:spacing w:lineRule="auto" w:line="360" w:before="0" w:after="0"/>
-        <w:jc w:val="both"/>
-        <w:rPr/>
-      </w:pPr>
-      <w:r>
-        <w:rPr/>
-      </w:r>
-    </w:p>
-    <w:p>
-      <w:pPr>
-        <w:pStyle w:val="Normal"/>
-        <w:spacing w:lineRule="auto" w:line="360" w:before="0" w:after="0"/>
-        <w:jc w:val="both"/>
-        <w:rPr/>
-      </w:pPr>
-      <w:r>
-        <w:rPr/>
-      </w:r>
-    </w:p>
-    <w:p>
-      <w:pPr>
-        <w:pStyle w:val="Normal"/>
-        <w:spacing w:lineRule="auto" w:line="360" w:before="0" w:after="0"/>
-        <w:jc w:val="center"/>
-        <w:rPr>
-          <w:rFonts w:ascii="Liberation Serif" w:hAnsi="Liberation Serif"/>
-          <w:sz w:val="28"/>
-          <w:szCs w:val="28"/>
-        </w:rPr>
-      </w:pPr>
-      <w:r>
-        <w:rPr>
-          <w:rFonts w:ascii="Liberation Serif" w:hAnsi="Liberation Serif"/>
-          <w:sz w:val="28"/>
-          <w:szCs w:val="28"/>
-        </w:rPr>
-        <w:t>Рисунок 7 — Диаграмма последовательности создания проекта</w:t>
-      </w:r>
-    </w:p>
-    <w:p>
-      <w:pPr>
-        <w:pStyle w:val="Normal"/>
-        <w:spacing w:lineRule="auto" w:line="360" w:before="0" w:after="0"/>
-        <w:jc w:val="center"/>
-        <w:rPr>
-          <w:rFonts w:ascii="Liberation Serif" w:hAnsi="Liberation Serif"/>
-          <w:sz w:val="28"/>
-          <w:szCs w:val="28"/>
-        </w:rPr>
-      </w:pPr>
-      <w:r>
-        <w:rPr>
-          <w:rFonts w:ascii="Liberation Serif" w:hAnsi="Liberation Serif"/>
-          <w:sz w:val="28"/>
-          <w:szCs w:val="28"/>
-        </w:rPr>
-      </w:r>
-    </w:p>
-    <w:p>
-      <w:pPr>
-        <w:pStyle w:val="Normal"/>
-        <w:spacing w:lineRule="auto" w:line="360" w:before="0" w:after="0"/>
-        <w:jc w:val="center"/>
-        <w:rPr>
-          <w:rFonts w:ascii="Liberation Serif" w:hAnsi="Liberation Serif"/>
-          <w:sz w:val="28"/>
-          <w:szCs w:val="28"/>
-        </w:rPr>
-      </w:pPr>
-      <w:r>
-        <w:rPr>
-          <w:rFonts w:ascii="Liberation Serif" w:hAnsi="Liberation Serif"/>
-          <w:sz w:val="28"/>
-          <w:szCs w:val="28"/>
-        </w:rPr>
-      </w:r>
-    </w:p>
-    <w:p>
-      <w:pPr>
-        <w:pStyle w:val="Normal"/>
-        <w:spacing w:lineRule="auto" w:line="360" w:before="0" w:after="0"/>
-        <w:jc w:val="both"/>
-        <w:rPr>
-          <w:rFonts w:ascii="Liberation Serif" w:hAnsi="Liberation Serif"/>
-          <w:sz w:val="28"/>
-          <w:szCs w:val="28"/>
-        </w:rPr>
-      </w:pPr>
-      <w:r>
-        <w:rPr>
-          <w:rFonts w:ascii="Liberation Serif" w:hAnsi="Liberation Serif"/>
+          <w:b/>
+          <w:bCs/>
+          <w:color w:val="FFFFFF"/>
+          <w:sz w:val="28"/>
+          <w:szCs w:val="28"/>
+        </w:rPr>
+      </w:pPr>
+      <w:r>
+        <w:rPr>
+          <w:rFonts w:ascii="Liberation Serif" w:hAnsi="Liberation Serif"/>
+          <w:b/>
+          <w:bCs/>
+          <w:color w:themeColor="accent1" w:themeShade="bf" w:val="FFFFFF"/>
           <w:sz w:val="28"/>
           <w:szCs w:val="28"/>
         </w:rPr>
@@ -11031,19 +10054,19 @@
         <w:jc w:val="center"/>
         <w:rPr>
           <w:rFonts w:ascii="Liberation Serif" w:hAnsi="Liberation Serif"/>
-          <w:b w:val="false"/>
-          <w:bCs w:val="false"/>
-          <w:color w:val="FFFFFF"/>
-          <w:sz w:val="28"/>
-          <w:szCs w:val="28"/>
-        </w:rPr>
-      </w:pPr>
-      <w:r>
-        <w:rPr>
-          <w:rFonts w:ascii="Liberation Serif" w:hAnsi="Liberation Serif"/>
-          <w:b w:val="false"/>
-          <w:bCs w:val="false"/>
-          <w:color w:val="FFFFFF"/>
+          <w:b/>
+          <w:bCs/>
+          <w:color w:val="FFFFFF"/>
+          <w:sz w:val="28"/>
+          <w:szCs w:val="28"/>
+        </w:rPr>
+      </w:pPr>
+      <w:r>
+        <w:rPr>
+          <w:rFonts w:ascii="Liberation Serif" w:hAnsi="Liberation Serif"/>
+          <w:b/>
+          <w:bCs/>
+          <w:color w:themeColor="accent1" w:themeShade="bf" w:val="FFFFFF"/>
           <w:sz w:val="28"/>
           <w:szCs w:val="28"/>
         </w:rPr>
@@ -11068,7 +10091,7 @@
           <w:rFonts w:ascii="Liberation Serif" w:hAnsi="Liberation Serif"/>
           <w:b/>
           <w:bCs/>
-          <w:color w:val="FFFFFF"/>
+          <w:color w:themeColor="accent1" w:themeShade="bf" w:val="FFFFFF"/>
           <w:sz w:val="28"/>
           <w:szCs w:val="28"/>
         </w:rPr>
@@ -11093,7 +10116,7 @@
           <w:rFonts w:ascii="Liberation Serif" w:hAnsi="Liberation Serif"/>
           <w:b/>
           <w:bCs/>
-          <w:color w:val="FFFFFF"/>
+          <w:color w:themeColor="accent1" w:themeShade="bf" w:val="FFFFFF"/>
           <w:sz w:val="28"/>
           <w:szCs w:val="28"/>
         </w:rPr>
@@ -11118,7 +10141,7 @@
           <w:rFonts w:ascii="Liberation Serif" w:hAnsi="Liberation Serif"/>
           <w:b/>
           <w:bCs/>
-          <w:color w:val="FFFFFF"/>
+          <w:color w:themeColor="accent1" w:themeShade="bf" w:val="FFFFFF"/>
           <w:sz w:val="28"/>
           <w:szCs w:val="28"/>
         </w:rPr>
@@ -11143,7 +10166,7 @@
           <w:rFonts w:ascii="Liberation Serif" w:hAnsi="Liberation Serif"/>
           <w:b/>
           <w:bCs/>
-          <w:color w:val="FFFFFF"/>
+          <w:color w:themeColor="accent1" w:themeShade="bf" w:val="FFFFFF"/>
           <w:sz w:val="28"/>
           <w:szCs w:val="28"/>
         </w:rPr>
@@ -11168,7 +10191,7 @@
           <w:rFonts w:ascii="Liberation Serif" w:hAnsi="Liberation Serif"/>
           <w:b/>
           <w:bCs/>
-          <w:color w:val="FFFFFF"/>
+          <w:color w:themeColor="accent1" w:themeShade="bf" w:val="FFFFFF"/>
           <w:sz w:val="28"/>
           <w:szCs w:val="28"/>
         </w:rPr>
@@ -11193,7 +10216,7 @@
           <w:rFonts w:ascii="Liberation Serif" w:hAnsi="Liberation Serif"/>
           <w:b/>
           <w:bCs/>
-          <w:color w:val="FFFFFF"/>
+          <w:color w:themeColor="accent1" w:themeShade="bf" w:val="FFFFFF"/>
           <w:sz w:val="28"/>
           <w:szCs w:val="28"/>
         </w:rPr>
@@ -11218,7 +10241,7 @@
           <w:rFonts w:ascii="Liberation Serif" w:hAnsi="Liberation Serif"/>
           <w:b/>
           <w:bCs/>
-          <w:color w:val="FFFFFF"/>
+          <w:color w:themeColor="accent1" w:themeShade="bf" w:val="FFFFFF"/>
           <w:sz w:val="28"/>
           <w:szCs w:val="28"/>
         </w:rPr>
@@ -11243,7 +10266,7 @@
           <w:rFonts w:ascii="Liberation Serif" w:hAnsi="Liberation Serif"/>
           <w:b/>
           <w:bCs/>
-          <w:color w:val="FFFFFF"/>
+          <w:color w:themeColor="accent1" w:themeShade="bf" w:val="FFFFFF"/>
           <w:sz w:val="28"/>
           <w:szCs w:val="28"/>
         </w:rPr>
@@ -11268,7 +10291,7 @@
           <w:rFonts w:ascii="Liberation Serif" w:hAnsi="Liberation Serif"/>
           <w:b/>
           <w:bCs/>
-          <w:color w:val="FFFFFF"/>
+          <w:color w:themeColor="accent1" w:themeShade="bf" w:val="FFFFFF"/>
           <w:sz w:val="28"/>
           <w:szCs w:val="28"/>
         </w:rPr>
@@ -11293,7 +10316,7 @@
           <w:rFonts w:ascii="Liberation Serif" w:hAnsi="Liberation Serif"/>
           <w:b/>
           <w:bCs/>
-          <w:color w:val="FFFFFF"/>
+          <w:color w:themeColor="accent1" w:themeShade="bf" w:val="FFFFFF"/>
           <w:sz w:val="28"/>
           <w:szCs w:val="28"/>
         </w:rPr>
@@ -11318,7 +10341,7 @@
           <w:rFonts w:ascii="Liberation Serif" w:hAnsi="Liberation Serif"/>
           <w:b/>
           <w:bCs/>
-          <w:color w:val="FFFFFF"/>
+          <w:color w:themeColor="accent1" w:themeShade="bf" w:val="FFFFFF"/>
           <w:sz w:val="28"/>
           <w:szCs w:val="28"/>
         </w:rPr>
@@ -11343,7 +10366,7 @@
           <w:rFonts w:ascii="Liberation Serif" w:hAnsi="Liberation Serif"/>
           <w:b/>
           <w:bCs/>
-          <w:color w:val="FFFFFF"/>
+          <w:color w:themeColor="accent1" w:themeShade="bf" w:val="FFFFFF"/>
           <w:sz w:val="28"/>
           <w:szCs w:val="28"/>
         </w:rPr>
@@ -11368,7 +10391,7 @@
           <w:rFonts w:ascii="Liberation Serif" w:hAnsi="Liberation Serif"/>
           <w:b/>
           <w:bCs/>
-          <w:color w:val="FFFFFF"/>
+          <w:color w:themeColor="accent1" w:themeShade="bf" w:val="FFFFFF"/>
           <w:sz w:val="28"/>
           <w:szCs w:val="28"/>
         </w:rPr>
@@ -11393,7 +10416,7 @@
           <w:rFonts w:ascii="Liberation Serif" w:hAnsi="Liberation Serif"/>
           <w:b/>
           <w:bCs/>
-          <w:color w:val="FFFFFF"/>
+          <w:color w:themeColor="accent1" w:themeShade="bf" w:val="FFFFFF"/>
           <w:sz w:val="28"/>
           <w:szCs w:val="28"/>
         </w:rPr>
@@ -11418,7 +10441,7 @@
           <w:rFonts w:ascii="Liberation Serif" w:hAnsi="Liberation Serif"/>
           <w:b/>
           <w:bCs/>
-          <w:color w:val="FFFFFF"/>
+          <w:color w:themeColor="accent1" w:themeShade="bf" w:val="FFFFFF"/>
           <w:sz w:val="28"/>
           <w:szCs w:val="28"/>
         </w:rPr>
@@ -11443,7 +10466,7 @@
           <w:rFonts w:ascii="Liberation Serif" w:hAnsi="Liberation Serif"/>
           <w:b/>
           <w:bCs/>
-          <w:color w:val="FFFFFF"/>
+          <w:color w:themeColor="accent1" w:themeShade="bf" w:val="FFFFFF"/>
           <w:sz w:val="28"/>
           <w:szCs w:val="28"/>
         </w:rPr>
@@ -11468,7 +10491,7 @@
           <w:rFonts w:ascii="Liberation Serif" w:hAnsi="Liberation Serif"/>
           <w:b/>
           <w:bCs/>
-          <w:color w:val="FFFFFF"/>
+          <w:color w:themeColor="accent1" w:themeShade="bf" w:val="FFFFFF"/>
           <w:sz w:val="28"/>
           <w:szCs w:val="28"/>
         </w:rPr>
@@ -11493,7 +10516,7 @@
           <w:rFonts w:ascii="Liberation Serif" w:hAnsi="Liberation Serif"/>
           <w:b/>
           <w:bCs/>
-          <w:color w:val="FFFFFF"/>
+          <w:color w:themeColor="accent1" w:themeShade="bf" w:val="FFFFFF"/>
           <w:sz w:val="28"/>
           <w:szCs w:val="28"/>
         </w:rPr>
@@ -11518,7 +10541,7 @@
           <w:rFonts w:ascii="Liberation Serif" w:hAnsi="Liberation Serif"/>
           <w:b/>
           <w:bCs/>
-          <w:color w:val="FFFFFF"/>
+          <w:color w:themeColor="accent1" w:themeShade="bf" w:val="FFFFFF"/>
           <w:sz w:val="28"/>
           <w:szCs w:val="28"/>
         </w:rPr>
@@ -11543,7 +10566,7 @@
           <w:rFonts w:ascii="Liberation Serif" w:hAnsi="Liberation Serif"/>
           <w:b/>
           <w:bCs/>
-          <w:color w:val="FFFFFF"/>
+          <w:color w:themeColor="accent1" w:themeShade="bf" w:val="FFFFFF"/>
           <w:sz w:val="28"/>
           <w:szCs w:val="28"/>
         </w:rPr>
@@ -11568,7 +10591,7 @@
           <w:rFonts w:ascii="Liberation Serif" w:hAnsi="Liberation Serif"/>
           <w:b/>
           <w:bCs/>
-          <w:color w:val="FFFFFF"/>
+          <w:color w:themeColor="accent1" w:themeShade="bf" w:val="FFFFFF"/>
           <w:sz w:val="28"/>
           <w:szCs w:val="28"/>
         </w:rPr>
@@ -11593,7 +10616,7 @@
           <w:rFonts w:ascii="Liberation Serif" w:hAnsi="Liberation Serif"/>
           <w:b/>
           <w:bCs/>
-          <w:color w:val="FFFFFF"/>
+          <w:color w:themeColor="accent1" w:themeShade="bf" w:val="FFFFFF"/>
           <w:sz w:val="28"/>
           <w:szCs w:val="28"/>
         </w:rPr>
@@ -11618,7 +10641,7 @@
           <w:rFonts w:ascii="Liberation Serif" w:hAnsi="Liberation Serif"/>
           <w:b/>
           <w:bCs/>
-          <w:color w:val="FFFFFF"/>
+          <w:color w:themeColor="accent1" w:themeShade="bf" w:val="FFFFFF"/>
           <w:sz w:val="28"/>
           <w:szCs w:val="28"/>
         </w:rPr>
@@ -11643,7 +10666,7 @@
           <w:rFonts w:ascii="Liberation Serif" w:hAnsi="Liberation Serif"/>
           <w:b/>
           <w:bCs/>
-          <w:color w:val="FFFFFF"/>
+          <w:color w:themeColor="accent1" w:themeShade="bf" w:val="FFFFFF"/>
           <w:sz w:val="28"/>
           <w:szCs w:val="28"/>
         </w:rPr>
@@ -11668,7 +10691,7 @@
           <w:rFonts w:ascii="Liberation Serif" w:hAnsi="Liberation Serif"/>
           <w:b/>
           <w:bCs/>
-          <w:color w:val="FFFFFF"/>
+          <w:color w:themeColor="accent1" w:themeShade="bf" w:val="FFFFFF"/>
           <w:sz w:val="28"/>
           <w:szCs w:val="28"/>
         </w:rPr>
@@ -11693,7 +10716,7 @@
           <w:rFonts w:ascii="Liberation Serif" w:hAnsi="Liberation Serif"/>
           <w:b/>
           <w:bCs/>
-          <w:color w:val="FFFFFF"/>
+          <w:color w:themeColor="accent1" w:themeShade="bf" w:val="FFFFFF"/>
           <w:sz w:val="28"/>
           <w:szCs w:val="28"/>
         </w:rPr>
@@ -11718,7 +10741,7 @@
           <w:rFonts w:ascii="Liberation Serif" w:hAnsi="Liberation Serif"/>
           <w:b/>
           <w:bCs/>
-          <w:color w:val="FFFFFF"/>
+          <w:color w:themeColor="accent1" w:themeShade="bf" w:val="FFFFFF"/>
           <w:sz w:val="28"/>
           <w:szCs w:val="28"/>
         </w:rPr>
@@ -11743,7 +10766,7 @@
           <w:rFonts w:ascii="Liberation Serif" w:hAnsi="Liberation Serif"/>
           <w:b/>
           <w:bCs/>
-          <w:color w:val="FFFFFF"/>
+          <w:color w:themeColor="accent1" w:themeShade="bf" w:val="FFFFFF"/>
           <w:sz w:val="28"/>
           <w:szCs w:val="28"/>
         </w:rPr>
@@ -11768,7 +10791,7 @@
           <w:rFonts w:ascii="Liberation Serif" w:hAnsi="Liberation Serif"/>
           <w:b/>
           <w:bCs/>
-          <w:color w:val="FFFFFF"/>
+          <w:color w:themeColor="accent1" w:themeShade="bf" w:val="FFFFFF"/>
           <w:sz w:val="28"/>
           <w:szCs w:val="28"/>
         </w:rPr>
@@ -11793,7 +10816,7 @@
           <w:rFonts w:ascii="Liberation Serif" w:hAnsi="Liberation Serif"/>
           <w:b/>
           <w:bCs/>
-          <w:color w:val="FFFFFF"/>
+          <w:color w:themeColor="accent1" w:themeShade="bf" w:val="FFFFFF"/>
           <w:sz w:val="28"/>
           <w:szCs w:val="28"/>
         </w:rPr>
@@ -11818,7 +10841,7 @@
           <w:rFonts w:ascii="Liberation Serif" w:hAnsi="Liberation Serif"/>
           <w:b/>
           <w:bCs/>
-          <w:color w:val="FFFFFF"/>
+          <w:color w:themeColor="accent1" w:themeShade="bf" w:val="FFFFFF"/>
           <w:sz w:val="28"/>
           <w:szCs w:val="28"/>
         </w:rPr>
@@ -11843,7 +10866,7 @@
           <w:rFonts w:ascii="Liberation Serif" w:hAnsi="Liberation Serif"/>
           <w:b/>
           <w:bCs/>
-          <w:color w:val="FFFFFF"/>
+          <w:color w:themeColor="accent1" w:themeShade="bf" w:val="FFFFFF"/>
           <w:sz w:val="28"/>
           <w:szCs w:val="28"/>
         </w:rPr>
@@ -11868,7 +10891,7 @@
           <w:rFonts w:ascii="Liberation Serif" w:hAnsi="Liberation Serif"/>
           <w:b/>
           <w:bCs/>
-          <w:color w:val="FFFFFF"/>
+          <w:color w:themeColor="accent1" w:themeShade="bf" w:val="FFFFFF"/>
           <w:sz w:val="28"/>
           <w:szCs w:val="28"/>
         </w:rPr>
@@ -11893,7 +10916,7 @@
           <w:rFonts w:ascii="Liberation Serif" w:hAnsi="Liberation Serif"/>
           <w:b/>
           <w:bCs/>
-          <w:color w:val="FFFFFF"/>
+          <w:color w:themeColor="accent1" w:themeShade="bf" w:val="FFFFFF"/>
           <w:sz w:val="28"/>
           <w:szCs w:val="28"/>
         </w:rPr>
@@ -11918,7 +10941,7 @@
           <w:rFonts w:ascii="Liberation Serif" w:hAnsi="Liberation Serif"/>
           <w:b/>
           <w:bCs/>
-          <w:color w:val="FFFFFF"/>
+          <w:color w:themeColor="accent1" w:themeShade="bf" w:val="FFFFFF"/>
           <w:sz w:val="28"/>
           <w:szCs w:val="28"/>
         </w:rPr>
@@ -11943,7 +10966,7 @@
           <w:rFonts w:ascii="Liberation Serif" w:hAnsi="Liberation Serif"/>
           <w:b/>
           <w:bCs/>
-          <w:color w:val="FFFFFF"/>
+          <w:color w:themeColor="accent1" w:themeShade="bf" w:val="FFFFFF"/>
           <w:sz w:val="28"/>
           <w:szCs w:val="28"/>
         </w:rPr>
@@ -11968,7 +10991,7 @@
           <w:rFonts w:ascii="Liberation Serif" w:hAnsi="Liberation Serif"/>
           <w:b/>
           <w:bCs/>
-          <w:color w:val="FFFFFF"/>
+          <w:color w:themeColor="accent1" w:themeShade="bf" w:val="FFFFFF"/>
           <w:sz w:val="28"/>
           <w:szCs w:val="28"/>
         </w:rPr>
@@ -11993,7 +11016,7 @@
           <w:rFonts w:ascii="Liberation Serif" w:hAnsi="Liberation Serif"/>
           <w:b/>
           <w:bCs/>
-          <w:color w:val="FFFFFF"/>
+          <w:color w:themeColor="accent1" w:themeShade="bf" w:val="FFFFFF"/>
           <w:sz w:val="28"/>
           <w:szCs w:val="28"/>
         </w:rPr>
@@ -12018,7 +11041,7 @@
           <w:rFonts w:ascii="Liberation Serif" w:hAnsi="Liberation Serif"/>
           <w:b/>
           <w:bCs/>
-          <w:color w:val="FFFFFF"/>
+          <w:color w:themeColor="accent1" w:themeShade="bf" w:val="FFFFFF"/>
           <w:sz w:val="28"/>
           <w:szCs w:val="28"/>
         </w:rPr>
@@ -12043,7 +11066,7 @@
           <w:rFonts w:ascii="Liberation Serif" w:hAnsi="Liberation Serif"/>
           <w:b/>
           <w:bCs/>
-          <w:color w:val="FFFFFF"/>
+          <w:color w:themeColor="accent1" w:themeShade="bf" w:val="FFFFFF"/>
           <w:sz w:val="28"/>
           <w:szCs w:val="28"/>
         </w:rPr>
@@ -12068,7 +11091,7 @@
           <w:rFonts w:ascii="Liberation Serif" w:hAnsi="Liberation Serif"/>
           <w:b/>
           <w:bCs/>
-          <w:color w:val="FFFFFF"/>
+          <w:color w:themeColor="accent1" w:themeShade="bf" w:val="FFFFFF"/>
           <w:sz w:val="28"/>
           <w:szCs w:val="28"/>
         </w:rPr>
@@ -12093,7 +11116,7 @@
           <w:rFonts w:ascii="Liberation Serif" w:hAnsi="Liberation Serif"/>
           <w:b/>
           <w:bCs/>
-          <w:color w:val="FFFFFF"/>
+          <w:color w:themeColor="accent1" w:themeShade="bf" w:val="FFFFFF"/>
           <w:sz w:val="28"/>
           <w:szCs w:val="28"/>
         </w:rPr>
@@ -12118,7 +11141,7 @@
           <w:rFonts w:ascii="Liberation Serif" w:hAnsi="Liberation Serif"/>
           <w:b/>
           <w:bCs/>
-          <w:color w:val="FFFFFF"/>
+          <w:color w:themeColor="accent1" w:themeShade="bf" w:val="FFFFFF"/>
           <w:sz w:val="28"/>
           <w:szCs w:val="28"/>
         </w:rPr>
@@ -12143,7 +11166,7 @@
           <w:rFonts w:ascii="Liberation Serif" w:hAnsi="Liberation Serif"/>
           <w:b/>
           <w:bCs/>
-          <w:color w:val="FFFFFF"/>
+          <w:color w:themeColor="accent1" w:themeShade="bf" w:val="FFFFFF"/>
           <w:sz w:val="28"/>
           <w:szCs w:val="28"/>
         </w:rPr>
@@ -12168,7 +11191,7 @@
           <w:rFonts w:ascii="Liberation Serif" w:hAnsi="Liberation Serif"/>
           <w:b/>
           <w:bCs/>
-          <w:color w:val="FFFFFF"/>
+          <w:color w:themeColor="accent1" w:themeShade="bf" w:val="FFFFFF"/>
           <w:sz w:val="28"/>
           <w:szCs w:val="28"/>
         </w:rPr>
@@ -12193,7 +11216,7 @@
           <w:rFonts w:ascii="Liberation Serif" w:hAnsi="Liberation Serif"/>
           <w:b/>
           <w:bCs/>
-          <w:color w:val="FFFFFF"/>
+          <w:color w:themeColor="accent1" w:themeShade="bf" w:val="FFFFFF"/>
           <w:sz w:val="28"/>
           <w:szCs w:val="28"/>
         </w:rPr>
@@ -12218,7 +11241,7 @@
           <w:rFonts w:ascii="Liberation Serif" w:hAnsi="Liberation Serif"/>
           <w:b/>
           <w:bCs/>
-          <w:color w:val="FFFFFF"/>
+          <w:color w:themeColor="accent1" w:themeShade="bf" w:val="FFFFFF"/>
           <w:sz w:val="28"/>
           <w:szCs w:val="28"/>
         </w:rPr>
@@ -12243,7 +11266,7 @@
           <w:rFonts w:ascii="Liberation Serif" w:hAnsi="Liberation Serif"/>
           <w:b/>
           <w:bCs/>
-          <w:color w:val="FFFFFF"/>
+          <w:color w:themeColor="accent1" w:themeShade="bf" w:val="FFFFFF"/>
           <w:sz w:val="28"/>
           <w:szCs w:val="28"/>
         </w:rPr>
@@ -12268,7 +11291,7 @@
           <w:rFonts w:ascii="Liberation Serif" w:hAnsi="Liberation Serif"/>
           <w:b/>
           <w:bCs/>
-          <w:color w:val="FFFFFF"/>
+          <w:color w:themeColor="accent1" w:themeShade="bf" w:val="FFFFFF"/>
           <w:sz w:val="28"/>
           <w:szCs w:val="28"/>
         </w:rPr>
@@ -12293,7 +11316,7 @@
           <w:rFonts w:ascii="Liberation Serif" w:hAnsi="Liberation Serif"/>
           <w:b/>
           <w:bCs/>
-          <w:color w:val="FFFFFF"/>
+          <w:color w:themeColor="accent1" w:themeShade="bf" w:val="FFFFFF"/>
           <w:sz w:val="28"/>
           <w:szCs w:val="28"/>
         </w:rPr>
@@ -12318,7 +11341,7 @@
           <w:rFonts w:ascii="Liberation Serif" w:hAnsi="Liberation Serif"/>
           <w:b/>
           <w:bCs/>
-          <w:color w:val="FFFFFF"/>
+          <w:color w:themeColor="accent1" w:themeShade="bf" w:val="FFFFFF"/>
           <w:sz w:val="28"/>
           <w:szCs w:val="28"/>
         </w:rPr>
@@ -12343,7 +11366,7 @@
           <w:rFonts w:ascii="Liberation Serif" w:hAnsi="Liberation Serif"/>
           <w:b/>
           <w:bCs/>
-          <w:color w:val="FFFFFF"/>
+          <w:color w:themeColor="accent1" w:themeShade="bf" w:val="FFFFFF"/>
           <w:sz w:val="28"/>
           <w:szCs w:val="28"/>
         </w:rPr>
@@ -12368,7 +11391,7 @@
           <w:rFonts w:ascii="Liberation Serif" w:hAnsi="Liberation Serif"/>
           <w:b/>
           <w:bCs/>
-          <w:color w:val="FFFFFF"/>
+          <w:color w:themeColor="accent1" w:themeShade="bf" w:val="FFFFFF"/>
           <w:sz w:val="28"/>
           <w:szCs w:val="28"/>
         </w:rPr>
@@ -12393,7 +11416,7 @@
           <w:rFonts w:ascii="Liberation Serif" w:hAnsi="Liberation Serif"/>
           <w:b/>
           <w:bCs/>
-          <w:color w:val="FFFFFF"/>
+          <w:color w:themeColor="accent1" w:themeShade="bf" w:val="FFFFFF"/>
           <w:sz w:val="28"/>
           <w:szCs w:val="28"/>
         </w:rPr>
@@ -12418,382 +11441,7 @@
           <w:rFonts w:ascii="Liberation Serif" w:hAnsi="Liberation Serif"/>
           <w:b/>
           <w:bCs/>
-          <w:color w:val="FFFFFF"/>
-          <w:sz w:val="28"/>
-          <w:szCs w:val="28"/>
-        </w:rPr>
-      </w:r>
-    </w:p>
-    <w:p>
-      <w:pPr>
-        <w:pStyle w:val="Heading1"/>
-        <w:spacing w:before="0" w:after="0"/>
-        <w:jc w:val="center"/>
-        <w:rPr>
-          <w:rFonts w:ascii="Liberation Serif" w:hAnsi="Liberation Serif"/>
-          <w:b/>
-          <w:bCs/>
-          <w:color w:val="FFFFFF"/>
-          <w:sz w:val="28"/>
-          <w:szCs w:val="28"/>
-        </w:rPr>
-      </w:pPr>
-      <w:r>
-        <w:rPr>
-          <w:rFonts w:ascii="Liberation Serif" w:hAnsi="Liberation Serif"/>
-          <w:b/>
-          <w:bCs/>
-          <w:color w:val="FFFFFF"/>
-          <w:sz w:val="28"/>
-          <w:szCs w:val="28"/>
-        </w:rPr>
-      </w:r>
-    </w:p>
-    <w:p>
-      <w:pPr>
-        <w:pStyle w:val="Heading1"/>
-        <w:spacing w:before="0" w:after="0"/>
-        <w:jc w:val="center"/>
-        <w:rPr>
-          <w:rFonts w:ascii="Liberation Serif" w:hAnsi="Liberation Serif"/>
-          <w:b/>
-          <w:bCs/>
-          <w:color w:val="FFFFFF"/>
-          <w:sz w:val="28"/>
-          <w:szCs w:val="28"/>
-        </w:rPr>
-      </w:pPr>
-      <w:r>
-        <w:rPr>
-          <w:rFonts w:ascii="Liberation Serif" w:hAnsi="Liberation Serif"/>
-          <w:b/>
-          <w:bCs/>
-          <w:color w:val="FFFFFF"/>
-          <w:sz w:val="28"/>
-          <w:szCs w:val="28"/>
-        </w:rPr>
-      </w:r>
-    </w:p>
-    <w:p>
-      <w:pPr>
-        <w:pStyle w:val="Heading1"/>
-        <w:spacing w:before="0" w:after="0"/>
-        <w:jc w:val="center"/>
-        <w:rPr>
-          <w:rFonts w:ascii="Liberation Serif" w:hAnsi="Liberation Serif"/>
-          <w:b/>
-          <w:bCs/>
-          <w:color w:val="FFFFFF"/>
-          <w:sz w:val="28"/>
-          <w:szCs w:val="28"/>
-        </w:rPr>
-      </w:pPr>
-      <w:r>
-        <w:rPr>
-          <w:rFonts w:ascii="Liberation Serif" w:hAnsi="Liberation Serif"/>
-          <w:b/>
-          <w:bCs/>
-          <w:color w:val="FFFFFF"/>
-          <w:sz w:val="28"/>
-          <w:szCs w:val="28"/>
-        </w:rPr>
-      </w:r>
-    </w:p>
-    <w:p>
-      <w:pPr>
-        <w:pStyle w:val="Heading1"/>
-        <w:spacing w:before="0" w:after="0"/>
-        <w:jc w:val="center"/>
-        <w:rPr>
-          <w:rFonts w:ascii="Liberation Serif" w:hAnsi="Liberation Serif"/>
-          <w:b/>
-          <w:bCs/>
-          <w:color w:val="FFFFFF"/>
-          <w:sz w:val="28"/>
-          <w:szCs w:val="28"/>
-        </w:rPr>
-      </w:pPr>
-      <w:r>
-        <w:rPr>
-          <w:rFonts w:ascii="Liberation Serif" w:hAnsi="Liberation Serif"/>
-          <w:b/>
-          <w:bCs/>
-          <w:color w:val="FFFFFF"/>
-          <w:sz w:val="28"/>
-          <w:szCs w:val="28"/>
-        </w:rPr>
-      </w:r>
-    </w:p>
-    <w:p>
-      <w:pPr>
-        <w:pStyle w:val="Heading1"/>
-        <w:spacing w:before="0" w:after="0"/>
-        <w:jc w:val="center"/>
-        <w:rPr>
-          <w:rFonts w:ascii="Liberation Serif" w:hAnsi="Liberation Serif"/>
-          <w:b/>
-          <w:bCs/>
-          <w:color w:val="FFFFFF"/>
-          <w:sz w:val="28"/>
-          <w:szCs w:val="28"/>
-        </w:rPr>
-      </w:pPr>
-      <w:r>
-        <w:rPr>
-          <w:rFonts w:ascii="Liberation Serif" w:hAnsi="Liberation Serif"/>
-          <w:b/>
-          <w:bCs/>
-          <w:color w:val="FFFFFF"/>
-          <w:sz w:val="28"/>
-          <w:szCs w:val="28"/>
-        </w:rPr>
-      </w:r>
-    </w:p>
-    <w:p>
-      <w:pPr>
-        <w:pStyle w:val="Heading1"/>
-        <w:spacing w:before="0" w:after="0"/>
-        <w:jc w:val="center"/>
-        <w:rPr>
-          <w:rFonts w:ascii="Liberation Serif" w:hAnsi="Liberation Serif"/>
-          <w:b/>
-          <w:bCs/>
-          <w:color w:val="FFFFFF"/>
-          <w:sz w:val="28"/>
-          <w:szCs w:val="28"/>
-        </w:rPr>
-      </w:pPr>
-      <w:r>
-        <w:rPr>
-          <w:rFonts w:ascii="Liberation Serif" w:hAnsi="Liberation Serif"/>
-          <w:b/>
-          <w:bCs/>
-          <w:color w:val="FFFFFF"/>
-          <w:sz w:val="28"/>
-          <w:szCs w:val="28"/>
-        </w:rPr>
-      </w:r>
-    </w:p>
-    <w:p>
-      <w:pPr>
-        <w:pStyle w:val="Heading1"/>
-        <w:spacing w:before="0" w:after="0"/>
-        <w:jc w:val="center"/>
-        <w:rPr>
-          <w:rFonts w:ascii="Liberation Serif" w:hAnsi="Liberation Serif"/>
-          <w:b/>
-          <w:bCs/>
-          <w:color w:val="FFFFFF"/>
-          <w:sz w:val="28"/>
-          <w:szCs w:val="28"/>
-        </w:rPr>
-      </w:pPr>
-      <w:r>
-        <w:rPr>
-          <w:rFonts w:ascii="Liberation Serif" w:hAnsi="Liberation Serif"/>
-          <w:b/>
-          <w:bCs/>
-          <w:color w:val="FFFFFF"/>
-          <w:sz w:val="28"/>
-          <w:szCs w:val="28"/>
-        </w:rPr>
-      </w:r>
-    </w:p>
-    <w:p>
-      <w:pPr>
-        <w:pStyle w:val="Heading1"/>
-        <w:spacing w:before="0" w:after="0"/>
-        <w:jc w:val="center"/>
-        <w:rPr>
-          <w:rFonts w:ascii="Liberation Serif" w:hAnsi="Liberation Serif"/>
-          <w:b/>
-          <w:bCs/>
-          <w:color w:val="FFFFFF"/>
-          <w:sz w:val="28"/>
-          <w:szCs w:val="28"/>
-        </w:rPr>
-      </w:pPr>
-      <w:r>
-        <w:rPr>
-          <w:rFonts w:ascii="Liberation Serif" w:hAnsi="Liberation Serif"/>
-          <w:b/>
-          <w:bCs/>
-          <w:color w:val="FFFFFF"/>
-          <w:sz w:val="28"/>
-          <w:szCs w:val="28"/>
-        </w:rPr>
-      </w:r>
-    </w:p>
-    <w:p>
-      <w:pPr>
-        <w:pStyle w:val="Heading1"/>
-        <w:spacing w:before="0" w:after="0"/>
-        <w:jc w:val="center"/>
-        <w:rPr>
-          <w:rFonts w:ascii="Liberation Serif" w:hAnsi="Liberation Serif"/>
-          <w:b/>
-          <w:bCs/>
-          <w:color w:val="FFFFFF"/>
-          <w:sz w:val="28"/>
-          <w:szCs w:val="28"/>
-        </w:rPr>
-      </w:pPr>
-      <w:r>
-        <w:rPr>
-          <w:rFonts w:ascii="Liberation Serif" w:hAnsi="Liberation Serif"/>
-          <w:b/>
-          <w:bCs/>
-          <w:color w:val="FFFFFF"/>
-          <w:sz w:val="28"/>
-          <w:szCs w:val="28"/>
-        </w:rPr>
-      </w:r>
-    </w:p>
-    <w:p>
-      <w:pPr>
-        <w:pStyle w:val="Heading1"/>
-        <w:spacing w:before="0" w:after="0"/>
-        <w:jc w:val="center"/>
-        <w:rPr>
-          <w:rFonts w:ascii="Liberation Serif" w:hAnsi="Liberation Serif"/>
-          <w:b/>
-          <w:bCs/>
-          <w:color w:val="FFFFFF"/>
-          <w:sz w:val="28"/>
-          <w:szCs w:val="28"/>
-        </w:rPr>
-      </w:pPr>
-      <w:r>
-        <w:rPr>
-          <w:rFonts w:ascii="Liberation Serif" w:hAnsi="Liberation Serif"/>
-          <w:b/>
-          <w:bCs/>
-          <w:color w:val="FFFFFF"/>
-          <w:sz w:val="28"/>
-          <w:szCs w:val="28"/>
-        </w:rPr>
-      </w:r>
-    </w:p>
-    <w:p>
-      <w:pPr>
-        <w:pStyle w:val="Heading1"/>
-        <w:spacing w:before="0" w:after="0"/>
-        <w:jc w:val="center"/>
-        <w:rPr>
-          <w:rFonts w:ascii="Liberation Serif" w:hAnsi="Liberation Serif"/>
-          <w:b/>
-          <w:bCs/>
-          <w:color w:val="FFFFFF"/>
-          <w:sz w:val="28"/>
-          <w:szCs w:val="28"/>
-        </w:rPr>
-      </w:pPr>
-      <w:r>
-        <w:rPr>
-          <w:rFonts w:ascii="Liberation Serif" w:hAnsi="Liberation Serif"/>
-          <w:b/>
-          <w:bCs/>
-          <w:color w:val="FFFFFF"/>
-          <w:sz w:val="28"/>
-          <w:szCs w:val="28"/>
-        </w:rPr>
-      </w:r>
-    </w:p>
-    <w:p>
-      <w:pPr>
-        <w:pStyle w:val="Heading1"/>
-        <w:spacing w:before="0" w:after="0"/>
-        <w:jc w:val="center"/>
-        <w:rPr>
-          <w:rFonts w:ascii="Liberation Serif" w:hAnsi="Liberation Serif"/>
-          <w:b/>
-          <w:bCs/>
-          <w:color w:val="FFFFFF"/>
-          <w:sz w:val="28"/>
-          <w:szCs w:val="28"/>
-        </w:rPr>
-      </w:pPr>
-      <w:r>
-        <w:rPr>
-          <w:rFonts w:ascii="Liberation Serif" w:hAnsi="Liberation Serif"/>
-          <w:b/>
-          <w:bCs/>
-          <w:color w:val="FFFFFF"/>
-          <w:sz w:val="28"/>
-          <w:szCs w:val="28"/>
-        </w:rPr>
-      </w:r>
-    </w:p>
-    <w:p>
-      <w:pPr>
-        <w:pStyle w:val="Heading1"/>
-        <w:spacing w:before="0" w:after="0"/>
-        <w:jc w:val="center"/>
-        <w:rPr>
-          <w:rFonts w:ascii="Liberation Serif" w:hAnsi="Liberation Serif"/>
-          <w:b/>
-          <w:bCs/>
-          <w:color w:val="FFFFFF"/>
-          <w:sz w:val="28"/>
-          <w:szCs w:val="28"/>
-        </w:rPr>
-      </w:pPr>
-      <w:r>
-        <w:rPr>
-          <w:rFonts w:ascii="Liberation Serif" w:hAnsi="Liberation Serif"/>
-          <w:b/>
-          <w:bCs/>
-          <w:color w:val="FFFFFF"/>
-          <w:sz w:val="28"/>
-          <w:szCs w:val="28"/>
-        </w:rPr>
-      </w:r>
-    </w:p>
-    <w:p>
-      <w:pPr>
-        <w:pStyle w:val="Heading1"/>
-        <w:spacing w:before="0" w:after="0"/>
-        <w:jc w:val="center"/>
-        <w:rPr>
-          <w:rFonts w:ascii="Liberation Serif" w:hAnsi="Liberation Serif"/>
-          <w:b/>
-          <w:bCs/>
-          <w:color w:val="FFFFFF"/>
-          <w:sz w:val="28"/>
-          <w:szCs w:val="28"/>
-        </w:rPr>
-      </w:pPr>
-      <w:r>
-        <w:rPr>
-          <w:rFonts w:ascii="Liberation Serif" w:hAnsi="Liberation Serif"/>
-          <w:b/>
-          <w:bCs/>
-          <w:color w:val="FFFFFF"/>
-          <w:sz w:val="28"/>
-          <w:szCs w:val="28"/>
-        </w:rPr>
-      </w:r>
-    </w:p>
-    <w:p>
-      <w:pPr>
-        <w:pStyle w:val="Heading1"/>
-        <w:spacing w:before="0" w:after="0"/>
-        <w:jc w:val="center"/>
-        <w:rPr>
-          <w:rFonts w:ascii="Liberation Serif" w:hAnsi="Liberation Serif"/>
-          <w:b/>
-          <w:bCs/>
-          <w:color w:val="FFFFFF"/>
-          <w:sz w:val="28"/>
-          <w:szCs w:val="28"/>
-        </w:rPr>
-      </w:pPr>
-      <w:r>
-        <w:rPr>
-          <w:rFonts w:ascii="Liberation Serif" w:hAnsi="Liberation Serif"/>
-          <w:b/>
-          <w:bCs/>
-          <w:color w:val="FFFFFF"/>
+          <w:color w:themeColor="accent1" w:themeShade="bf" w:val="FFFFFF"/>
           <w:sz w:val="28"/>
           <w:szCs w:val="28"/>
         </w:rPr>
@@ -12915,9 +11563,9 @@
       </w:r>
     </w:p>
     <w:sectPr>
-      <w:headerReference w:type="even" r:id="rId9"/>
-      <w:headerReference w:type="default" r:id="rId10"/>
-      <w:headerReference w:type="first" r:id="rId11"/>
+      <w:headerReference w:type="even" r:id="rId7"/>
+      <w:headerReference w:type="default" r:id="rId8"/>
+      <w:headerReference w:type="first" r:id="rId9"/>
       <w:type w:val="nextPage"/>
       <w:pgSz w:w="11906" w:h="16838"/>
       <w:pgMar w:left="1701" w:right="850" w:gutter="0" w:header="708" w:top="1134" w:footer="0" w:bottom="1134"/>
@@ -12984,7 +11632,7 @@
         </w:r>
         <w:r>
           <w:rPr/>
-          <w:t>29</w:t>
+          <w:t>26</w:t>
         </w:r>
         <w:r>
           <w:rPr/>
@@ -15121,8 +13769,8 @@
       <w:szCs w:val="20"/>
     </w:rPr>
   </w:style>
-  <w:style w:type="character" w:styleId="user" w:customStyle="1">
-    <w:name w:val="Символ концевой сноски (user)"/>
+  <w:style w:type="character" w:styleId="Style15" w:customStyle="1">
+    <w:name w:val="Символ концевой сноски"/>
     <w:uiPriority w:val="99"/>
     <w:semiHidden/>
     <w:unhideWhenUsed/>
@@ -15132,8 +13780,8 @@
       <w:vertAlign w:val="superscript"/>
     </w:rPr>
   </w:style>
-  <w:style w:type="character" w:styleId="Style15" w:customStyle="1">
-    <w:name w:val="Символ концевой сноски"/>
+  <w:style w:type="character" w:styleId="user" w:customStyle="1">
+    <w:name w:val="Символ концевой сноски (user)"/>
     <w:qFormat/>
     <w:rPr>
       <w:vertAlign w:val="superscript"/>
@@ -15187,43 +13835,43 @@
       <w:iCs/>
     </w:rPr>
   </w:style>
-  <w:style w:type="character" w:styleId="user1" w:customStyle="1">
+  <w:style w:type="character" w:styleId="Style16" w:customStyle="1">
+    <w:name w:val="Ссылка указателя"/>
+    <w:qFormat/>
+    <w:rPr/>
+  </w:style>
+  <w:style w:type="character" w:styleId="Style17">
+    <w:name w:val="Маркеры"/>
+    <w:qFormat/>
+    <w:rPr>
+      <w:rFonts w:ascii="OpenSymbol" w:hAnsi="OpenSymbol" w:eastAsia="OpenSymbol" w:cs="OpenSymbol"/>
+    </w:rPr>
+  </w:style>
+  <w:style w:type="character" w:styleId="Style18">
+    <w:name w:val="Символ нумерации"/>
+    <w:qFormat/>
+    <w:rPr/>
+  </w:style>
+  <w:style w:type="character" w:styleId="Style19">
+    <w:name w:val="Исходный текст"/>
+    <w:qFormat/>
+    <w:rPr>
+      <w:rFonts w:ascii="Liberation Mono" w:hAnsi="Liberation Mono" w:eastAsia="Liberation Mono" w:cs="Liberation Mono"/>
+    </w:rPr>
+  </w:style>
+  <w:style w:type="character" w:styleId="user1">
     <w:name w:val="Ссылка указателя (user)"/>
     <w:qFormat/>
     <w:rPr/>
   </w:style>
   <w:style w:type="character" w:styleId="user2">
-    <w:name w:val="Маркеры (user)"/>
-    <w:qFormat/>
-    <w:rPr>
-      <w:rFonts w:ascii="OpenSymbol" w:hAnsi="OpenSymbol" w:eastAsia="OpenSymbol" w:cs="OpenSymbol"/>
-    </w:rPr>
-  </w:style>
-  <w:style w:type="character" w:styleId="user3">
-    <w:name w:val="Символ нумерации (user)"/>
-    <w:qFormat/>
-    <w:rPr/>
-  </w:style>
-  <w:style w:type="character" w:styleId="user4">
     <w:name w:val="Исходный текст (user)"/>
     <w:qFormat/>
     <w:rPr>
       <w:rFonts w:ascii="Liberation Mono" w:hAnsi="Liberation Mono" w:eastAsia="Liberation Mono" w:cs="Liberation Mono"/>
     </w:rPr>
   </w:style>
-  <w:style w:type="character" w:styleId="Style16">
-    <w:name w:val="Ссылка указателя"/>
-    <w:qFormat/>
-    <w:rPr/>
-  </w:style>
-  <w:style w:type="character" w:styleId="Style17">
-    <w:name w:val="Исходный текст"/>
-    <w:qFormat/>
-    <w:rPr>
-      <w:rFonts w:ascii="Liberation Mono" w:hAnsi="Liberation Mono" w:eastAsia="Liberation Mono" w:cs="Liberation Mono"/>
-    </w:rPr>
-  </w:style>
-  <w:style w:type="paragraph" w:styleId="Style18">
+  <w:style w:type="paragraph" w:styleId="Style20" w:customStyle="1">
     <w:name w:val="Заголовок"/>
     <w:basedOn w:val="Normal"/>
     <w:next w:val="BodyText"/>
@@ -15273,7 +13921,7 @@
       <w:szCs w:val="18"/>
     </w:rPr>
   </w:style>
-  <w:style w:type="paragraph" w:styleId="Style19">
+  <w:style w:type="paragraph" w:styleId="Style21" w:customStyle="1">
     <w:name w:val="Указатель"/>
     <w:basedOn w:val="Normal"/>
     <w:qFormat/>
@@ -15284,7 +13932,7 @@
       <w:rFonts w:cs="Noto Sans Devanagari"/>
     </w:rPr>
   </w:style>
-  <w:style w:type="paragraph" w:styleId="user5" w:customStyle="1">
+  <w:style w:type="paragraph" w:styleId="user3">
     <w:name w:val="Заголовок (user)"/>
     <w:basedOn w:val="Normal"/>
     <w:next w:val="BodyText"/>
@@ -15299,7 +13947,7 @@
       <w:szCs w:val="28"/>
     </w:rPr>
   </w:style>
-  <w:style w:type="paragraph" w:styleId="user6" w:customStyle="1">
+  <w:style w:type="paragraph" w:styleId="user4">
     <w:name w:val="Указатель (user)"/>
     <w:basedOn w:val="Normal"/>
     <w:qFormat/>
@@ -15332,7 +13980,7 @@
   </w:style>
   <w:style w:type="paragraph" w:styleId="IndexHeading">
     <w:name w:val="index heading"/>
-    <w:basedOn w:val="user5"/>
+    <w:basedOn w:val="Style20"/>
     <w:pPr/>
     <w:rPr/>
   </w:style>
@@ -15563,21 +14211,31 @@
       <w:szCs w:val="20"/>
     </w:rPr>
   </w:style>
-  <w:style w:type="paragraph" w:styleId="user7" w:customStyle="1">
+  <w:style w:type="paragraph" w:styleId="Style22" w:customStyle="1">
+    <w:name w:val="Содержимое врезки"/>
+    <w:basedOn w:val="Normal"/>
+    <w:qFormat/>
+    <w:pPr/>
+    <w:rPr/>
+  </w:style>
+  <w:style w:type="paragraph" w:styleId="user5" w:customStyle="1">
     <w:name w:val="Содержимое врезки (user)"/>
     <w:basedOn w:val="Normal"/>
     <w:qFormat/>
     <w:pPr/>
     <w:rPr/>
   </w:style>
-  <w:style w:type="paragraph" w:styleId="Style20" w:customStyle="1">
-    <w:name w:val="Содержимое врезки"/>
+  <w:style w:type="paragraph" w:styleId="user6" w:customStyle="1">
+    <w:name w:val="Содержимое таблицы (user)"/>
     <w:basedOn w:val="Normal"/>
     <w:qFormat/>
-    <w:pPr/>
+    <w:pPr>
+      <w:widowControl w:val="false"/>
+      <w:suppressLineNumbers/>
+    </w:pPr>
     <w:rPr/>
   </w:style>
-  <w:style w:type="paragraph" w:styleId="Style21" w:customStyle="1">
+  <w:style w:type="paragraph" w:styleId="Style23">
     <w:name w:val="Содержимое таблицы"/>
     <w:basedOn w:val="Normal"/>
     <w:qFormat/>
@@ -15587,19 +14245,9 @@
     </w:pPr>
     <w:rPr/>
   </w:style>
-  <w:style w:type="paragraph" w:styleId="user8">
-    <w:name w:val="Содержимое таблицы (user)"/>
-    <w:basedOn w:val="Normal"/>
-    <w:qFormat/>
-    <w:pPr>
-      <w:widowControl w:val="false"/>
-      <w:suppressLineNumbers/>
-    </w:pPr>
-    <w:rPr/>
-  </w:style>
-  <w:style w:type="paragraph" w:styleId="user9">
-    <w:name w:val="Заголовок таблицы (user)"/>
-    <w:basedOn w:val="user8"/>
+  <w:style w:type="paragraph" w:styleId="Style24">
+    <w:name w:val="Заголовок таблицы"/>
+    <w:basedOn w:val="Style23"/>
     <w:qFormat/>
     <w:pPr>
       <w:suppressLineNumbers/>
@@ -15610,15 +14258,15 @@
       <w:bCs/>
     </w:rPr>
   </w:style>
-  <w:style w:type="numbering" w:styleId="user10" w:customStyle="1">
-    <w:name w:val="Без списка (user)"/>
+  <w:style w:type="numbering" w:styleId="Style25" w:customStyle="1">
+    <w:name w:val="Без списка"/>
     <w:uiPriority w:val="99"/>
     <w:semiHidden/>
     <w:unhideWhenUsed/>
     <w:qFormat/>
   </w:style>
-  <w:style w:type="numbering" w:styleId="user11">
-    <w:name w:val="Маркированный • (user)"/>
+  <w:style w:type="numbering" w:styleId="Style26">
+    <w:name w:val="Маркированный •"/>
     <w:qFormat/>
   </w:style>
   <w:style w:type="table" w:default="1" w:styleId="a1">

</xml_diff>